<commit_message>
nuevos cambios (documento word 1)
</commit_message>
<xml_diff>
--- a/BuildCorp/docs/Informe EVA 3 – BuildCorp Sistema de Alquiler y Control de Herramientas.docx
+++ b/BuildCorp/docs/Informe EVA 3 – BuildCorp Sistema de Alquiler y Control de Herramientas.docx
@@ -515,6 +515,83 @@
           <w:lang w:val="es-CL"/>
         </w:rPr>
         <w:lastRenderedPageBreak/>
+        <w:drawing>
+          <wp:inline distT="0" distB="0" distL="0" distR="0" wp14:anchorId="0BE0DA8C" wp14:editId="1E728F6E">
+            <wp:extent cx="6746077" cy="1744980"/>
+            <wp:effectExtent l="0" t="0" r="0" b="7620"/>
+            <wp:docPr id="1847399644" name="Imagen 1"/>
+            <wp:cNvGraphicFramePr>
+              <a:graphicFrameLocks xmlns:a="http://schemas.openxmlformats.org/drawingml/2006/main" noChangeAspect="1"/>
+            </wp:cNvGraphicFramePr>
+            <a:graphic xmlns:a="http://schemas.openxmlformats.org/drawingml/2006/main">
+              <a:graphicData uri="http://schemas.openxmlformats.org/drawingml/2006/picture">
+                <pic:pic xmlns:pic="http://schemas.openxmlformats.org/drawingml/2006/picture">
+                  <pic:nvPicPr>
+                    <pic:cNvPr id="0" name="Picture 1"/>
+                    <pic:cNvPicPr>
+                      <a:picLocks noChangeAspect="1" noChangeArrowheads="1"/>
+                    </pic:cNvPicPr>
+                  </pic:nvPicPr>
+                  <pic:blipFill>
+                    <a:blip r:embed="rId6" cstate="print">
+                      <a:extLst>
+                        <a:ext uri="{28A0092B-C50C-407E-A947-70E740481C1C}">
+                          <a14:useLocalDpi xmlns:a14="http://schemas.microsoft.com/office/drawing/2010/main" val="0"/>
+                        </a:ext>
+                      </a:extLst>
+                    </a:blip>
+                    <a:srcRect/>
+                    <a:stretch>
+                      <a:fillRect/>
+                    </a:stretch>
+                  </pic:blipFill>
+                  <pic:spPr bwMode="auto">
+                    <a:xfrm>
+                      <a:off x="0" y="0"/>
+                      <a:ext cx="6756220" cy="1747604"/>
+                    </a:xfrm>
+                    <a:prstGeom prst="rect">
+                      <a:avLst/>
+                    </a:prstGeom>
+                    <a:noFill/>
+                    <a:ln>
+                      <a:noFill/>
+                    </a:ln>
+                  </pic:spPr>
+                </pic:pic>
+              </a:graphicData>
+            </a:graphic>
+          </wp:inline>
+        </w:drawing>
+      </w:r>
+    </w:p>
+    <w:p>
+      <w:pPr>
+        <w:pStyle w:val="Ttulo3"/>
+        <w:rPr>
+          <w:lang w:val="es-CL"/>
+        </w:rPr>
+      </w:pPr>
+    </w:p>
+    <w:p>
+      <w:pPr>
+        <w:pStyle w:val="Ttulo3"/>
+        <w:rPr>
+          <w:lang w:val="es-CL"/>
+        </w:rPr>
+      </w:pPr>
+    </w:p>
+    <w:p>
+      <w:pPr>
+        <w:pStyle w:val="Ttulo3"/>
+        <w:rPr>
+          <w:lang w:val="es-CL"/>
+        </w:rPr>
+      </w:pPr>
+      <w:r>
+        <w:rPr>
+          <w:lang w:val="es-CL"/>
+        </w:rPr>
         <w:t>1.1 Registro de Hitos y Reuniones con el Cliente (BuildCorp)</w:t>
       </w:r>
     </w:p>
@@ -1150,6 +1227,7 @@
           </w:tcPr>
           <w:p>
             <w:r>
+              <w:lastRenderedPageBreak/>
               <w:t>TK-04</w:t>
             </w:r>
           </w:p>
@@ -1510,7 +1588,6 @@
           </w:tcPr>
           <w:p>
             <w:r>
-              <w:lastRenderedPageBreak/>
               <w:t>TK-10</w:t>
             </w:r>
           </w:p>
@@ -2078,6 +2155,7 @@
         <w:rPr>
           <w:lang w:val="es-CL"/>
         </w:rPr>
+        <w:lastRenderedPageBreak/>
         <w:t>3. Definición del Catálogo de Activos y Control de Inventario</w:t>
       </w:r>
     </w:p>
@@ -2276,7 +2354,6 @@
           <w:b/>
           <w:lang w:val="es-CL"/>
         </w:rPr>
-        <w:lastRenderedPageBreak/>
         <w:t>Valor Comercial / Tarifa de Arriendo:</w:t>
       </w:r>
       <w:r>
@@ -2657,6 +2734,7 @@
         <w:rPr>
           <w:lang w:val="es-CL"/>
         </w:rPr>
+        <w:lastRenderedPageBreak/>
         <w:t>4. Análisis y Diseño UML (Sprint 2 — Parte I)</w:t>
       </w:r>
     </w:p>
@@ -2825,7 +2903,6 @@
           </w:tcPr>
           <w:p>
             <w:r>
-              <w:lastRenderedPageBreak/>
               <w:t>2</w:t>
             </w:r>
           </w:p>
@@ -3121,6 +3198,7 @@
           <w:noProof/>
           <w:lang w:val="es-CL"/>
         </w:rPr>
+        <w:lastRenderedPageBreak/>
         <w:drawing>
           <wp:inline distT="0" distB="0" distL="0" distR="0" wp14:anchorId="7F831FCE" wp14:editId="0C910E4B">
             <wp:extent cx="5943600" cy="2891790"/>
@@ -3137,7 +3215,7 @@
                     <pic:cNvPicPr/>
                   </pic:nvPicPr>
                   <pic:blipFill>
-                    <a:blip r:embed="rId6"/>
+                    <a:blip r:embed="rId7"/>
                     <a:stretch>
                       <a:fillRect/>
                     </a:stretch>
@@ -3217,7 +3295,6 @@
           <w:b/>
           <w:lang w:val="es-CL"/>
         </w:rPr>
-        <w:lastRenderedPageBreak/>
         <w:t>Actor principal:</w:t>
       </w:r>
       <w:r>
@@ -3468,6 +3545,7 @@
         <w:rPr>
           <w:lang w:val="es-CL"/>
         </w:rPr>
+        <w:lastRenderedPageBreak/>
         <w:t>El Sistema Central valida la disponibilidad del activo y que el contratista no posea bloqueos por morosidad.</w:t>
       </w:r>
     </w:p>
@@ -3749,7 +3827,6 @@
         <w:rPr>
           <w:b/>
         </w:rPr>
-        <w:lastRenderedPageBreak/>
         <w:t>Precondiciones</w:t>
       </w:r>
       <w:proofErr w:type="spellEnd"/>
@@ -3996,6 +4073,7 @@
         <w:rPr>
           <w:b/>
         </w:rPr>
+        <w:lastRenderedPageBreak/>
         <w:t>Flujos</w:t>
       </w:r>
       <w:proofErr w:type="spellEnd"/>
@@ -5137,7 +5215,6 @@
   <w:style w:type="character" w:default="1" w:styleId="Fuentedeprrafopredeter">
     <w:name w:val="Default Paragraph Font"/>
     <w:uiPriority w:val="1"/>
-    <w:semiHidden/>
     <w:unhideWhenUsed/>
   </w:style>
   <w:style w:type="table" w:default="1" w:styleId="Tablanormal">

</xml_diff>

<commit_message>
feat(sprint-3): finaliza casos de uso CU-04 y CU-05, diagrama subsistema 2 y cierre de EVA 3
</commit_message>
<xml_diff>
--- a/BuildCorp/docs/Informe EVA 3 – BuildCorp Sistema de Alquiler y Control de Herramientas.docx
+++ b/BuildCorp/docs/Informe EVA 3 – BuildCorp Sistema de Alquiler y Control de Herramientas.docx
@@ -512,6 +512,7 @@
       </w:pPr>
       <w:r>
         <w:rPr>
+          <w:noProof/>
           <w:lang w:val="es-CL"/>
         </w:rPr>
         <w:lastRenderedPageBreak/>
@@ -4404,6 +4405,729 @@
         <w:t>) para su posterior sincronización al recuperar la señal.</w:t>
       </w:r>
     </w:p>
+    <w:p>
+      <w:pPr>
+        <w:rPr>
+          <w:lang w:val="es-CL"/>
+        </w:rPr>
+      </w:pPr>
+    </w:p>
+    <w:p>
+      <w:pPr>
+        <w:rPr>
+          <w:lang w:val="es-CL"/>
+        </w:rPr>
+      </w:pPr>
+    </w:p>
+    <w:p>
+      <w:pPr>
+        <w:rPr>
+          <w:lang w:val="es-CL"/>
+        </w:rPr>
+      </w:pPr>
+    </w:p>
+    <w:p>
+      <w:pPr>
+        <w:rPr>
+          <w:lang w:val="es-CL"/>
+        </w:rPr>
+      </w:pPr>
+    </w:p>
+    <w:p>
+      <w:pPr>
+        <w:rPr>
+          <w:lang w:val="es-CL"/>
+        </w:rPr>
+      </w:pPr>
+    </w:p>
+    <w:p>
+      <w:pPr>
+        <w:rPr>
+          <w:lang w:val="es-CL"/>
+        </w:rPr>
+      </w:pPr>
+    </w:p>
+    <w:p>
+      <w:pPr>
+        <w:rPr>
+          <w:lang w:val="es-CL"/>
+        </w:rPr>
+      </w:pPr>
+    </w:p>
+    <w:p>
+      <w:pPr>
+        <w:rPr>
+          <w:lang w:val="es-CL"/>
+        </w:rPr>
+      </w:pPr>
+    </w:p>
+    <w:p>
+      <w:pPr>
+        <w:rPr>
+          <w:lang w:val="es-CL"/>
+        </w:rPr>
+      </w:pPr>
+    </w:p>
+    <w:p>
+      <w:pPr>
+        <w:rPr>
+          <w:lang w:val="es-CL"/>
+        </w:rPr>
+      </w:pPr>
+    </w:p>
+    <w:p>
+      <w:pPr>
+        <w:rPr>
+          <w:lang w:val="es-CL"/>
+        </w:rPr>
+      </w:pPr>
+    </w:p>
+    <w:p>
+      <w:pPr>
+        <w:rPr>
+          <w:lang w:val="es-CL"/>
+        </w:rPr>
+      </w:pPr>
+    </w:p>
+    <w:p>
+      <w:pPr>
+        <w:rPr>
+          <w:lang w:val="es-CL"/>
+        </w:rPr>
+      </w:pPr>
+    </w:p>
+    <w:p>
+      <w:pPr>
+        <w:rPr>
+          <w:lang w:val="es-CL"/>
+        </w:rPr>
+      </w:pPr>
+    </w:p>
+    <w:p>
+      <w:pPr>
+        <w:rPr>
+          <w:lang w:val="es-CL"/>
+        </w:rPr>
+      </w:pPr>
+      <w:r>
+        <w:rPr>
+          <w:b/>
+          <w:bCs/>
+          <w:lang w:val="es-CL"/>
+        </w:rPr>
+        <w:lastRenderedPageBreak/>
+        <w:t>4.4 Subsistema 2: Mantenimiento y Control Financiero</w:t>
+      </w:r>
+    </w:p>
+    <w:p>
+      <w:pPr>
+        <w:rPr>
+          <w:lang w:val="es-CL"/>
+        </w:rPr>
+      </w:pPr>
+      <w:r>
+        <w:rPr>
+          <w:lang w:val="es-CL"/>
+        </w:rPr>
+        <w:t xml:space="preserve">Figura 2. Diagrama de casos de uso — Subsistema 2: Mantenimiento y Control Financiero. </w:t>
+      </w:r>
+    </w:p>
+    <w:p>
+      <w:pPr>
+        <w:rPr>
+          <w:lang w:val="es-CL"/>
+        </w:rPr>
+      </w:pPr>
+      <w:r>
+        <w:rPr>
+          <w:lang w:val="es-CL"/>
+        </w:rPr>
+        <w:drawing>
+          <wp:inline distT="0" distB="0" distL="0" distR="0" wp14:anchorId="25F78646" wp14:editId="305D5DD4">
+            <wp:extent cx="5943600" cy="2760980"/>
+            <wp:effectExtent l="0" t="0" r="0" b="1270"/>
+            <wp:docPr id="1907629562" name="Imagen 1"/>
+            <wp:cNvGraphicFramePr>
+              <a:graphicFrameLocks xmlns:a="http://schemas.openxmlformats.org/drawingml/2006/main" noChangeAspect="1"/>
+            </wp:cNvGraphicFramePr>
+            <a:graphic xmlns:a="http://schemas.openxmlformats.org/drawingml/2006/main">
+              <a:graphicData uri="http://schemas.openxmlformats.org/drawingml/2006/picture">
+                <pic:pic xmlns:pic="http://schemas.openxmlformats.org/drawingml/2006/picture">
+                  <pic:nvPicPr>
+                    <pic:cNvPr id="1907629562" name=""/>
+                    <pic:cNvPicPr/>
+                  </pic:nvPicPr>
+                  <pic:blipFill>
+                    <a:blip r:embed="rId8"/>
+                    <a:stretch>
+                      <a:fillRect/>
+                    </a:stretch>
+                  </pic:blipFill>
+                  <pic:spPr>
+                    <a:xfrm>
+                      <a:off x="0" y="0"/>
+                      <a:ext cx="5943600" cy="2760980"/>
+                    </a:xfrm>
+                    <a:prstGeom prst="rect">
+                      <a:avLst/>
+                    </a:prstGeom>
+                  </pic:spPr>
+                </pic:pic>
+              </a:graphicData>
+            </a:graphic>
+          </wp:inline>
+        </w:drawing>
+      </w:r>
+    </w:p>
+    <w:p>
+      <w:pPr>
+        <w:rPr>
+          <w:lang w:val="es-CL"/>
+        </w:rPr>
+      </w:pPr>
+    </w:p>
+    <w:p>
+      <w:pPr>
+        <w:rPr>
+          <w:lang w:val="es-CL"/>
+        </w:rPr>
+      </w:pPr>
+      <w:r>
+        <w:rPr>
+          <w:lang w:val="es-CL"/>
+        </w:rPr>
+        <w:t xml:space="preserve">CU-04: Programar Mantenimiento Preventivo Descripción: permite al Técnico de Mantenimiento planificar intervenciones técnicas basadas en las horas de uso acumuladas de la maquinaria o herramientas críticas, evitando fallas imprevistas en terreno. Actor principal: Técnico de Mantenimiento. Actor de soporte: Sistema Central. Precondiciones: </w:t>
+      </w:r>
+    </w:p>
+    <w:p>
+      <w:pPr>
+        <w:rPr>
+          <w:lang w:val="es-CL"/>
+        </w:rPr>
+      </w:pPr>
+      <w:r>
+        <w:rPr>
+          <w:lang w:val="es-CL"/>
+        </w:rPr>
+        <w:t>image_785283.png+ 1</w:t>
+      </w:r>
+    </w:p>
+    <w:p>
+      <w:pPr>
+        <w:numPr>
+          <w:ilvl w:val="0"/>
+          <w:numId w:val="30"/>
+        </w:numPr>
+        <w:rPr>
+          <w:lang w:val="es-CL"/>
+        </w:rPr>
+      </w:pPr>
+      <w:r>
+        <w:rPr>
+          <w:lang w:val="es-CL"/>
+        </w:rPr>
+        <w:t>El activo debe registrar un conteo de horas de uso que alcance el umbral de desgaste programado, o haber sido derivado desde una devolución con daños.</w:t>
+      </w:r>
+    </w:p>
+    <w:p>
+      <w:pPr>
+        <w:numPr>
+          <w:ilvl w:val="0"/>
+          <w:numId w:val="30"/>
+        </w:numPr>
+        <w:rPr>
+          <w:lang w:val="es-CL"/>
+        </w:rPr>
+      </w:pPr>
+      <w:r>
+        <w:rPr>
+          <w:lang w:val="es-CL"/>
+        </w:rPr>
+        <w:t>El Técnico de Mantenimiento debe estar autenticado en la plataforma con el rol correspondiente. Postcondiciones:</w:t>
+      </w:r>
+    </w:p>
+    <w:p>
+      <w:pPr>
+        <w:numPr>
+          <w:ilvl w:val="0"/>
+          <w:numId w:val="30"/>
+        </w:numPr>
+        <w:rPr>
+          <w:lang w:val="es-CL"/>
+        </w:rPr>
+      </w:pPr>
+      <w:r>
+        <w:rPr>
+          <w:lang w:val="es-CL"/>
+        </w:rPr>
+        <w:t>El estado del activo cambia automáticamente a "Mantenimiento".</w:t>
+      </w:r>
+    </w:p>
+    <w:p>
+      <w:pPr>
+        <w:numPr>
+          <w:ilvl w:val="0"/>
+          <w:numId w:val="30"/>
+        </w:numPr>
+        <w:rPr>
+          <w:lang w:val="es-CL"/>
+        </w:rPr>
+      </w:pPr>
+      <w:r>
+        <w:rPr>
+          <w:lang w:val="es-CL"/>
+        </w:rPr>
+        <w:t>Se genera una Orden de Trabajo (OT) en la base de datos vinculada al taller central. Flujo principal (normal):</w:t>
+      </w:r>
+    </w:p>
+    <w:p>
+      <w:pPr>
+        <w:numPr>
+          <w:ilvl w:val="0"/>
+          <w:numId w:val="30"/>
+        </w:numPr>
+        <w:rPr>
+          <w:lang w:val="es-CL"/>
+        </w:rPr>
+      </w:pPr>
+      <w:r>
+        <w:rPr>
+          <w:lang w:val="es-CL"/>
+        </w:rPr>
+        <w:t>El Técnico de Mantenimiento ingresa a la sección de control y mantenimiento preventivo en el sistema.</w:t>
+      </w:r>
+    </w:p>
+    <w:p>
+      <w:pPr>
+        <w:numPr>
+          <w:ilvl w:val="0"/>
+          <w:numId w:val="30"/>
+        </w:numPr>
+        <w:rPr>
+          <w:lang w:val="es-CL"/>
+        </w:rPr>
+      </w:pPr>
+      <w:r>
+        <w:rPr>
+          <w:lang w:val="es-CL"/>
+        </w:rPr>
+        <w:t>El sistema despliega las alertas automáticas de activos que han superado el límite de horas de operación.</w:t>
+      </w:r>
+    </w:p>
+    <w:p>
+      <w:pPr>
+        <w:numPr>
+          <w:ilvl w:val="0"/>
+          <w:numId w:val="30"/>
+        </w:numPr>
+        <w:rPr>
+          <w:lang w:val="es-CL"/>
+        </w:rPr>
+      </w:pPr>
+      <w:r>
+        <w:rPr>
+          <w:lang w:val="es-CL"/>
+        </w:rPr>
+        <w:t>El técnico selecciona el activo a intervenir y define la fecha estimada de reposición.</w:t>
+      </w:r>
+    </w:p>
+    <w:p>
+      <w:pPr>
+        <w:numPr>
+          <w:ilvl w:val="0"/>
+          <w:numId w:val="30"/>
+        </w:numPr>
+        <w:rPr>
+          <w:lang w:val="es-CL"/>
+        </w:rPr>
+      </w:pPr>
+      <w:r>
+        <w:rPr>
+          <w:lang w:val="es-CL"/>
+        </w:rPr>
+        <w:t xml:space="preserve">El sistema registra la programación del mantenimiento, bloquea temporalmente el activo para nuevos préstamos y genera la Orden de Trabajo digital. Flujos alternativos: • 2a. El </w:t>
+      </w:r>
+      <w:r>
+        <w:rPr>
+          <w:lang w:val="es-CL"/>
+        </w:rPr>
+        <w:lastRenderedPageBreak/>
+        <w:t>mantenimiento es de carácter correctivo (por daños reportados en devolución): a. El técnico omite la alerta preventiva y selecciona directamente la opción "Registrar Orden de Reparación". b. El sistema asocia los repuestos necesarios y actualiza los costos asociados al historial financiero del activo.</w:t>
+      </w:r>
+    </w:p>
+    <w:p>
+      <w:pPr>
+        <w:rPr>
+          <w:lang w:val="es-CL"/>
+        </w:rPr>
+      </w:pPr>
+      <w:r>
+        <w:rPr>
+          <w:lang w:val="es-CL"/>
+        </w:rPr>
+        <w:t xml:space="preserve">CU-05: Generar Alerta de Morosidad y Bloqueo Descripción: mecanismo automatizado de control financiero que supervisa los plazos máximos de devolución de herramientas, emitiendo alertas </w:t>
+      </w:r>
+      <w:proofErr w:type="gramStart"/>
+      <w:r>
+        <w:rPr>
+          <w:lang w:val="es-CL"/>
+        </w:rPr>
+        <w:t>e</w:t>
+      </w:r>
+      <w:proofErr w:type="gramEnd"/>
+      <w:r>
+        <w:rPr>
+          <w:lang w:val="es-CL"/>
+        </w:rPr>
+        <w:t xml:space="preserve"> aplicando bloqueos preventivos a contratistas morosos. Actor principal: Administrador del Sistema. Actor de soporte: Sistema Central. Precondiciones: </w:t>
+      </w:r>
+    </w:p>
+    <w:p>
+      <w:pPr>
+        <w:numPr>
+          <w:ilvl w:val="0"/>
+          <w:numId w:val="31"/>
+        </w:numPr>
+        <w:rPr>
+          <w:lang w:val="es-CL"/>
+        </w:rPr>
+      </w:pPr>
+      <w:r>
+        <w:rPr>
+          <w:lang w:val="es-CL"/>
+        </w:rPr>
+        <w:t>El préstamo de la herramienta debe superar la fecha y hora límite estipulada al momento de la entrega en obra. Postcondiciones:</w:t>
+      </w:r>
+    </w:p>
+    <w:p>
+      <w:pPr>
+        <w:numPr>
+          <w:ilvl w:val="0"/>
+          <w:numId w:val="31"/>
+        </w:numPr>
+        <w:rPr>
+          <w:lang w:val="es-CL"/>
+        </w:rPr>
+      </w:pPr>
+      <w:r>
+        <w:rPr>
+          <w:lang w:val="es-CL"/>
+        </w:rPr>
+        <w:t>Se activa una bandera de morosidad (</w:t>
+      </w:r>
+      <w:proofErr w:type="spellStart"/>
+      <w:r>
+        <w:rPr>
+          <w:i/>
+          <w:iCs/>
+          <w:lang w:val="es-CL"/>
+        </w:rPr>
+        <w:t>enforces</w:t>
+      </w:r>
+      <w:proofErr w:type="spellEnd"/>
+      <w:r>
+        <w:rPr>
+          <w:lang w:val="es-CL"/>
+        </w:rPr>
+        <w:t xml:space="preserve">) sobre el perfil del Contratista / Responsable de Obra en la base de datos. </w:t>
+      </w:r>
+    </w:p>
+    <w:p>
+      <w:pPr>
+        <w:numPr>
+          <w:ilvl w:val="0"/>
+          <w:numId w:val="31"/>
+        </w:numPr>
+        <w:rPr>
+          <w:lang w:val="es-CL"/>
+        </w:rPr>
+      </w:pPr>
+      <w:r>
+        <w:rPr>
+          <w:lang w:val="es-CL"/>
+        </w:rPr>
+        <w:t>Se restringe automáticamente la emisión de nuevos préstamos de activos hasta que el administrador regularice la situación. Flujo principal (normal):</w:t>
+      </w:r>
+    </w:p>
+    <w:p>
+      <w:pPr>
+        <w:numPr>
+          <w:ilvl w:val="0"/>
+          <w:numId w:val="31"/>
+        </w:numPr>
+        <w:rPr>
+          <w:lang w:val="es-CL"/>
+        </w:rPr>
+      </w:pPr>
+      <w:r>
+        <w:rPr>
+          <w:lang w:val="es-CL"/>
+        </w:rPr>
+        <w:t>El Sistema Central ejecuta una rutina diaria de revisión de fechas de devolución vigentes.</w:t>
+      </w:r>
+    </w:p>
+    <w:p>
+      <w:pPr>
+        <w:numPr>
+          <w:ilvl w:val="0"/>
+          <w:numId w:val="31"/>
+        </w:numPr>
+        <w:rPr>
+          <w:lang w:val="es-CL"/>
+        </w:rPr>
+      </w:pPr>
+      <w:r>
+        <w:rPr>
+          <w:lang w:val="es-CL"/>
+        </w:rPr>
+        <w:t>El sistema detecta activos no devueltos fuera de plazo y cruza la información con el RUT del responsable.</w:t>
+      </w:r>
+    </w:p>
+    <w:p>
+      <w:pPr>
+        <w:numPr>
+          <w:ilvl w:val="0"/>
+          <w:numId w:val="31"/>
+        </w:numPr>
+        <w:rPr>
+          <w:lang w:val="es-CL"/>
+        </w:rPr>
+      </w:pPr>
+      <w:r>
+        <w:rPr>
+          <w:lang w:val="es-CL"/>
+        </w:rPr>
+        <w:t>El sistema actualiza el estado del contrato a "Moroso" y genera una notificación visual directa en el panel de control del Administrador del Sistema.</w:t>
+      </w:r>
+    </w:p>
+    <w:p>
+      <w:pPr>
+        <w:numPr>
+          <w:ilvl w:val="0"/>
+          <w:numId w:val="31"/>
+        </w:numPr>
+        <w:rPr>
+          <w:lang w:val="es-CL"/>
+        </w:rPr>
+      </w:pPr>
+      <w:r>
+        <w:rPr>
+          <w:lang w:val="es-CL"/>
+        </w:rPr>
+        <w:t>El Administrador del Sistema revisa la alerta y confirma el bloqueo preventivo del RUT del contratista. Flujos alternativos. El contratista efectúa la devolución tardía de la herramienta antes del cierre administrativo: a. Al registrarse la devolución exitosa (CU-02), el sistema revoca de manera automática la alerta de morosidad y libera el perfil del usuario para futuras operaciones en obra.</w:t>
+      </w:r>
+    </w:p>
+    <w:p>
+      <w:pPr>
+        <w:rPr>
+          <w:lang w:val="es-CL"/>
+        </w:rPr>
+      </w:pPr>
+    </w:p>
+    <w:p>
+      <w:pPr>
+        <w:rPr>
+          <w:lang w:val="es-CL"/>
+        </w:rPr>
+      </w:pPr>
+    </w:p>
+    <w:p>
+      <w:pPr>
+        <w:rPr>
+          <w:lang w:val="es-CL"/>
+        </w:rPr>
+      </w:pPr>
+    </w:p>
+    <w:p>
+      <w:pPr>
+        <w:rPr>
+          <w:lang w:val="es-CL"/>
+        </w:rPr>
+      </w:pPr>
+    </w:p>
+    <w:p>
+      <w:pPr>
+        <w:rPr>
+          <w:lang w:val="es-CL"/>
+        </w:rPr>
+      </w:pPr>
+    </w:p>
+    <w:p>
+      <w:pPr>
+        <w:rPr>
+          <w:lang w:val="es-CL"/>
+        </w:rPr>
+      </w:pPr>
+    </w:p>
+    <w:p>
+      <w:pPr>
+        <w:rPr>
+          <w:lang w:val="es-CL"/>
+        </w:rPr>
+      </w:pPr>
+    </w:p>
+    <w:p>
+      <w:pPr>
+        <w:rPr>
+          <w:lang w:val="es-CL"/>
+        </w:rPr>
+      </w:pPr>
+    </w:p>
+    <w:p>
+      <w:pPr>
+        <w:rPr>
+          <w:lang w:val="es-CL"/>
+        </w:rPr>
+      </w:pPr>
+    </w:p>
+    <w:p>
+      <w:pPr>
+        <w:rPr>
+          <w:lang w:val="es-CL"/>
+        </w:rPr>
+      </w:pPr>
+    </w:p>
+    <w:p>
+      <w:pPr>
+        <w:rPr>
+          <w:b/>
+          <w:bCs/>
+          <w:lang w:val="es-CL"/>
+        </w:rPr>
+      </w:pPr>
+      <w:r>
+        <w:rPr>
+          <w:b/>
+          <w:bCs/>
+          <w:lang w:val="es-CL"/>
+        </w:rPr>
+        <w:lastRenderedPageBreak/>
+        <w:t>5. Conclusiones y Cierre del Proyecto (Sprint 3)</w:t>
+      </w:r>
+    </w:p>
+    <w:p>
+      <w:pPr>
+        <w:rPr>
+          <w:lang w:val="es-CL"/>
+        </w:rPr>
+      </w:pPr>
+      <w:r>
+        <w:rPr>
+          <w:lang w:val="es-CL"/>
+        </w:rPr>
+        <w:t xml:space="preserve">El desarrollo del sistema de gestión de activos para BuildCorp —ejecutado bajo modalidad unipersonal y estructurado mediante </w:t>
+      </w:r>
+      <w:proofErr w:type="spellStart"/>
+      <w:r>
+        <w:rPr>
+          <w:lang w:val="es-CL"/>
+        </w:rPr>
+        <w:t>Sprints</w:t>
+      </w:r>
+      <w:proofErr w:type="spellEnd"/>
+      <w:r>
+        <w:rPr>
+          <w:lang w:val="es-CL"/>
+        </w:rPr>
+        <w:t>— permitió modelar una solución tecnológica robusta, orientada a resolver las problemáticas críticas de pérdida de maquinaria, falta de trazabilidad en bodegas de obra y retrasos en las devoluciones en terreno.</w:t>
+      </w:r>
+    </w:p>
+    <w:p>
+      <w:pPr>
+        <w:numPr>
+          <w:ilvl w:val="0"/>
+          <w:numId w:val="32"/>
+        </w:numPr>
+        <w:rPr>
+          <w:lang w:val="es-CL"/>
+        </w:rPr>
+      </w:pPr>
+      <w:r>
+        <w:rPr>
+          <w:b/>
+          <w:bCs/>
+          <w:lang w:val="es-CL"/>
+        </w:rPr>
+        <w:t>Cumplimiento de Objetivos:</w:t>
+      </w:r>
+      <w:r>
+        <w:rPr>
+          <w:lang w:val="es-CL"/>
+        </w:rPr>
+        <w:t xml:space="preserve"> A través de los </w:t>
+      </w:r>
+      <w:proofErr w:type="spellStart"/>
+      <w:r>
+        <w:rPr>
+          <w:lang w:val="es-CL"/>
+        </w:rPr>
+        <w:t>Sprints</w:t>
+      </w:r>
+      <w:proofErr w:type="spellEnd"/>
+      <w:r>
+        <w:rPr>
+          <w:lang w:val="es-CL"/>
+        </w:rPr>
+        <w:t xml:space="preserve"> 0 al 3, se consolidó un ciclo de desarrollo completo que abarcó desde la configuración del entorno de trabajo en GitHub hasta el modelado de diagramas UML avanzados y la especificación de casos de uso rigurosos. </w:t>
+      </w:r>
+    </w:p>
+    <w:p>
+      <w:pPr>
+        <w:numPr>
+          <w:ilvl w:val="0"/>
+          <w:numId w:val="32"/>
+        </w:numPr>
+        <w:rPr>
+          <w:lang w:val="es-CL"/>
+        </w:rPr>
+      </w:pPr>
+      <w:r>
+        <w:rPr>
+          <w:b/>
+          <w:bCs/>
+          <w:lang w:val="es-CL"/>
+        </w:rPr>
+        <w:t>Innovación Operativa (PWA y Offline First):</w:t>
+      </w:r>
+      <w:r>
+        <w:rPr>
+          <w:lang w:val="es-CL"/>
+        </w:rPr>
+        <w:t xml:space="preserve"> La incorporación de la captura de firma digital y la estrategia de sincronización local aseguran que la plataforma sea funcional incluso en obras con conectividad de red limitada o nula.</w:t>
+      </w:r>
+    </w:p>
+    <w:p>
+      <w:pPr>
+        <w:numPr>
+          <w:ilvl w:val="0"/>
+          <w:numId w:val="32"/>
+        </w:numPr>
+        <w:rPr>
+          <w:lang w:val="es-CL"/>
+        </w:rPr>
+      </w:pPr>
+      <w:r>
+        <w:rPr>
+          <w:b/>
+          <w:bCs/>
+          <w:lang w:val="es-CL"/>
+        </w:rPr>
+        <w:t>Control Financiero y Preventivo:</w:t>
+      </w:r>
+      <w:r>
+        <w:rPr>
+          <w:lang w:val="es-CL"/>
+        </w:rPr>
+        <w:t xml:space="preserve"> La integración de los subsistemas de mantenimiento preventivo (CU-04) y el bloqueo automático por morosidad (CU-05) garantizan un control financiero estricto y una mayor vida útil de los activos de la empresa. </w:t>
+      </w:r>
+    </w:p>
+    <w:p>
+      <w:pPr>
+        <w:rPr>
+          <w:lang w:val="es-CL"/>
+        </w:rPr>
+      </w:pPr>
+    </w:p>
     <w:sectPr>
       <w:pgSz w:w="12240" w:h="15840"/>
       <w:pgMar w:top="1440" w:right="1440" w:bottom="1440" w:left="1440" w:header="720" w:footer="720" w:gutter="0"/>
@@ -4583,6 +5307,381 @@
       <w:lvlText w:val="▪"/>
       <w:lvlJc w:val="left"/>
       <w:pPr>
+        <w:ind w:left="6480" w:hanging="360"/>
+      </w:pPr>
+    </w:lvl>
+  </w:abstractNum>
+  <w:abstractNum w:abstractNumId="2" w15:restartNumberingAfterBreak="0">
+    <w:nsid w:val="35BF23EB"/>
+    <w:multiLevelType w:val="multilevel"/>
+    <w:tmpl w:val="61BCE080"/>
+    <w:lvl w:ilvl="0">
+      <w:start w:val="1"/>
+      <w:numFmt w:val="bullet"/>
+      <w:lvlText w:val=""/>
+      <w:lvlJc w:val="left"/>
+      <w:pPr>
+        <w:tabs>
+          <w:tab w:val="num" w:pos="720"/>
+        </w:tabs>
+        <w:ind w:left="720" w:hanging="360"/>
+      </w:pPr>
+      <w:rPr>
+        <w:rFonts w:ascii="Symbol" w:hAnsi="Symbol" w:hint="default"/>
+        <w:sz w:val="20"/>
+      </w:rPr>
+    </w:lvl>
+    <w:lvl w:ilvl="1" w:tentative="1">
+      <w:start w:val="1"/>
+      <w:numFmt w:val="bullet"/>
+      <w:lvlText w:val="o"/>
+      <w:lvlJc w:val="left"/>
+      <w:pPr>
+        <w:tabs>
+          <w:tab w:val="num" w:pos="1440"/>
+        </w:tabs>
+        <w:ind w:left="1440" w:hanging="360"/>
+      </w:pPr>
+      <w:rPr>
+        <w:rFonts w:ascii="Courier New" w:hAnsi="Courier New" w:hint="default"/>
+        <w:sz w:val="20"/>
+      </w:rPr>
+    </w:lvl>
+    <w:lvl w:ilvl="2" w:tentative="1">
+      <w:start w:val="1"/>
+      <w:numFmt w:val="bullet"/>
+      <w:lvlText w:val=""/>
+      <w:lvlJc w:val="left"/>
+      <w:pPr>
+        <w:tabs>
+          <w:tab w:val="num" w:pos="2160"/>
+        </w:tabs>
+        <w:ind w:left="2160" w:hanging="360"/>
+      </w:pPr>
+      <w:rPr>
+        <w:rFonts w:ascii="Wingdings" w:hAnsi="Wingdings" w:hint="default"/>
+        <w:sz w:val="20"/>
+      </w:rPr>
+    </w:lvl>
+    <w:lvl w:ilvl="3" w:tentative="1">
+      <w:start w:val="1"/>
+      <w:numFmt w:val="bullet"/>
+      <w:lvlText w:val=""/>
+      <w:lvlJc w:val="left"/>
+      <w:pPr>
+        <w:tabs>
+          <w:tab w:val="num" w:pos="2880"/>
+        </w:tabs>
+        <w:ind w:left="2880" w:hanging="360"/>
+      </w:pPr>
+      <w:rPr>
+        <w:rFonts w:ascii="Wingdings" w:hAnsi="Wingdings" w:hint="default"/>
+        <w:sz w:val="20"/>
+      </w:rPr>
+    </w:lvl>
+    <w:lvl w:ilvl="4" w:tentative="1">
+      <w:start w:val="1"/>
+      <w:numFmt w:val="bullet"/>
+      <w:lvlText w:val=""/>
+      <w:lvlJc w:val="left"/>
+      <w:pPr>
+        <w:tabs>
+          <w:tab w:val="num" w:pos="3600"/>
+        </w:tabs>
+        <w:ind w:left="3600" w:hanging="360"/>
+      </w:pPr>
+      <w:rPr>
+        <w:rFonts w:ascii="Wingdings" w:hAnsi="Wingdings" w:hint="default"/>
+        <w:sz w:val="20"/>
+      </w:rPr>
+    </w:lvl>
+    <w:lvl w:ilvl="5" w:tentative="1">
+      <w:start w:val="1"/>
+      <w:numFmt w:val="bullet"/>
+      <w:lvlText w:val=""/>
+      <w:lvlJc w:val="left"/>
+      <w:pPr>
+        <w:tabs>
+          <w:tab w:val="num" w:pos="4320"/>
+        </w:tabs>
+        <w:ind w:left="4320" w:hanging="360"/>
+      </w:pPr>
+      <w:rPr>
+        <w:rFonts w:ascii="Wingdings" w:hAnsi="Wingdings" w:hint="default"/>
+        <w:sz w:val="20"/>
+      </w:rPr>
+    </w:lvl>
+    <w:lvl w:ilvl="6" w:tentative="1">
+      <w:start w:val="1"/>
+      <w:numFmt w:val="bullet"/>
+      <w:lvlText w:val=""/>
+      <w:lvlJc w:val="left"/>
+      <w:pPr>
+        <w:tabs>
+          <w:tab w:val="num" w:pos="5040"/>
+        </w:tabs>
+        <w:ind w:left="5040" w:hanging="360"/>
+      </w:pPr>
+      <w:rPr>
+        <w:rFonts w:ascii="Wingdings" w:hAnsi="Wingdings" w:hint="default"/>
+        <w:sz w:val="20"/>
+      </w:rPr>
+    </w:lvl>
+    <w:lvl w:ilvl="7" w:tentative="1">
+      <w:start w:val="1"/>
+      <w:numFmt w:val="bullet"/>
+      <w:lvlText w:val=""/>
+      <w:lvlJc w:val="left"/>
+      <w:pPr>
+        <w:tabs>
+          <w:tab w:val="num" w:pos="5760"/>
+        </w:tabs>
+        <w:ind w:left="5760" w:hanging="360"/>
+      </w:pPr>
+      <w:rPr>
+        <w:rFonts w:ascii="Wingdings" w:hAnsi="Wingdings" w:hint="default"/>
+        <w:sz w:val="20"/>
+      </w:rPr>
+    </w:lvl>
+    <w:lvl w:ilvl="8" w:tentative="1">
+      <w:start w:val="1"/>
+      <w:numFmt w:val="bullet"/>
+      <w:lvlText w:val=""/>
+      <w:lvlJc w:val="left"/>
+      <w:pPr>
+        <w:tabs>
+          <w:tab w:val="num" w:pos="6480"/>
+        </w:tabs>
+        <w:ind w:left="6480" w:hanging="360"/>
+      </w:pPr>
+      <w:rPr>
+        <w:rFonts w:ascii="Wingdings" w:hAnsi="Wingdings" w:hint="default"/>
+        <w:sz w:val="20"/>
+      </w:rPr>
+    </w:lvl>
+  </w:abstractNum>
+  <w:abstractNum w:abstractNumId="3" w15:restartNumberingAfterBreak="0">
+    <w:nsid w:val="3992617A"/>
+    <w:multiLevelType w:val="multilevel"/>
+    <w:tmpl w:val="7DC6B182"/>
+    <w:lvl w:ilvl="0">
+      <w:start w:val="1"/>
+      <w:numFmt w:val="decimal"/>
+      <w:lvlText w:val="%1."/>
+      <w:lvlJc w:val="left"/>
+      <w:pPr>
+        <w:tabs>
+          <w:tab w:val="num" w:pos="720"/>
+        </w:tabs>
+        <w:ind w:left="720" w:hanging="360"/>
+      </w:pPr>
+    </w:lvl>
+    <w:lvl w:ilvl="1" w:tentative="1">
+      <w:start w:val="1"/>
+      <w:numFmt w:val="decimal"/>
+      <w:lvlText w:val="%2."/>
+      <w:lvlJc w:val="left"/>
+      <w:pPr>
+        <w:tabs>
+          <w:tab w:val="num" w:pos="1440"/>
+        </w:tabs>
+        <w:ind w:left="1440" w:hanging="360"/>
+      </w:pPr>
+    </w:lvl>
+    <w:lvl w:ilvl="2" w:tentative="1">
+      <w:start w:val="1"/>
+      <w:numFmt w:val="decimal"/>
+      <w:lvlText w:val="%3."/>
+      <w:lvlJc w:val="left"/>
+      <w:pPr>
+        <w:tabs>
+          <w:tab w:val="num" w:pos="2160"/>
+        </w:tabs>
+        <w:ind w:left="2160" w:hanging="360"/>
+      </w:pPr>
+    </w:lvl>
+    <w:lvl w:ilvl="3" w:tentative="1">
+      <w:start w:val="1"/>
+      <w:numFmt w:val="decimal"/>
+      <w:lvlText w:val="%4."/>
+      <w:lvlJc w:val="left"/>
+      <w:pPr>
+        <w:tabs>
+          <w:tab w:val="num" w:pos="2880"/>
+        </w:tabs>
+        <w:ind w:left="2880" w:hanging="360"/>
+      </w:pPr>
+    </w:lvl>
+    <w:lvl w:ilvl="4" w:tentative="1">
+      <w:start w:val="1"/>
+      <w:numFmt w:val="decimal"/>
+      <w:lvlText w:val="%5."/>
+      <w:lvlJc w:val="left"/>
+      <w:pPr>
+        <w:tabs>
+          <w:tab w:val="num" w:pos="3600"/>
+        </w:tabs>
+        <w:ind w:left="3600" w:hanging="360"/>
+      </w:pPr>
+    </w:lvl>
+    <w:lvl w:ilvl="5" w:tentative="1">
+      <w:start w:val="1"/>
+      <w:numFmt w:val="decimal"/>
+      <w:lvlText w:val="%6."/>
+      <w:lvlJc w:val="left"/>
+      <w:pPr>
+        <w:tabs>
+          <w:tab w:val="num" w:pos="4320"/>
+        </w:tabs>
+        <w:ind w:left="4320" w:hanging="360"/>
+      </w:pPr>
+    </w:lvl>
+    <w:lvl w:ilvl="6" w:tentative="1">
+      <w:start w:val="1"/>
+      <w:numFmt w:val="decimal"/>
+      <w:lvlText w:val="%7."/>
+      <w:lvlJc w:val="left"/>
+      <w:pPr>
+        <w:tabs>
+          <w:tab w:val="num" w:pos="5040"/>
+        </w:tabs>
+        <w:ind w:left="5040" w:hanging="360"/>
+      </w:pPr>
+    </w:lvl>
+    <w:lvl w:ilvl="7" w:tentative="1">
+      <w:start w:val="1"/>
+      <w:numFmt w:val="decimal"/>
+      <w:lvlText w:val="%8."/>
+      <w:lvlJc w:val="left"/>
+      <w:pPr>
+        <w:tabs>
+          <w:tab w:val="num" w:pos="5760"/>
+        </w:tabs>
+        <w:ind w:left="5760" w:hanging="360"/>
+      </w:pPr>
+    </w:lvl>
+    <w:lvl w:ilvl="8" w:tentative="1">
+      <w:start w:val="1"/>
+      <w:numFmt w:val="decimal"/>
+      <w:lvlText w:val="%9."/>
+      <w:lvlJc w:val="left"/>
+      <w:pPr>
+        <w:tabs>
+          <w:tab w:val="num" w:pos="6480"/>
+        </w:tabs>
+        <w:ind w:left="6480" w:hanging="360"/>
+      </w:pPr>
+    </w:lvl>
+  </w:abstractNum>
+  <w:abstractNum w:abstractNumId="4" w15:restartNumberingAfterBreak="0">
+    <w:nsid w:val="6D703F37"/>
+    <w:multiLevelType w:val="multilevel"/>
+    <w:tmpl w:val="CF520C06"/>
+    <w:lvl w:ilvl="0">
+      <w:start w:val="1"/>
+      <w:numFmt w:val="decimal"/>
+      <w:lvlText w:val="%1."/>
+      <w:lvlJc w:val="left"/>
+      <w:pPr>
+        <w:tabs>
+          <w:tab w:val="num" w:pos="720"/>
+        </w:tabs>
+        <w:ind w:left="720" w:hanging="360"/>
+      </w:pPr>
+    </w:lvl>
+    <w:lvl w:ilvl="1" w:tentative="1">
+      <w:start w:val="1"/>
+      <w:numFmt w:val="decimal"/>
+      <w:lvlText w:val="%2."/>
+      <w:lvlJc w:val="left"/>
+      <w:pPr>
+        <w:tabs>
+          <w:tab w:val="num" w:pos="1440"/>
+        </w:tabs>
+        <w:ind w:left="1440" w:hanging="360"/>
+      </w:pPr>
+    </w:lvl>
+    <w:lvl w:ilvl="2" w:tentative="1">
+      <w:start w:val="1"/>
+      <w:numFmt w:val="decimal"/>
+      <w:lvlText w:val="%3."/>
+      <w:lvlJc w:val="left"/>
+      <w:pPr>
+        <w:tabs>
+          <w:tab w:val="num" w:pos="2160"/>
+        </w:tabs>
+        <w:ind w:left="2160" w:hanging="360"/>
+      </w:pPr>
+    </w:lvl>
+    <w:lvl w:ilvl="3" w:tentative="1">
+      <w:start w:val="1"/>
+      <w:numFmt w:val="decimal"/>
+      <w:lvlText w:val="%4."/>
+      <w:lvlJc w:val="left"/>
+      <w:pPr>
+        <w:tabs>
+          <w:tab w:val="num" w:pos="2880"/>
+        </w:tabs>
+        <w:ind w:left="2880" w:hanging="360"/>
+      </w:pPr>
+    </w:lvl>
+    <w:lvl w:ilvl="4" w:tentative="1">
+      <w:start w:val="1"/>
+      <w:numFmt w:val="decimal"/>
+      <w:lvlText w:val="%5."/>
+      <w:lvlJc w:val="left"/>
+      <w:pPr>
+        <w:tabs>
+          <w:tab w:val="num" w:pos="3600"/>
+        </w:tabs>
+        <w:ind w:left="3600" w:hanging="360"/>
+      </w:pPr>
+    </w:lvl>
+    <w:lvl w:ilvl="5" w:tentative="1">
+      <w:start w:val="1"/>
+      <w:numFmt w:val="decimal"/>
+      <w:lvlText w:val="%6."/>
+      <w:lvlJc w:val="left"/>
+      <w:pPr>
+        <w:tabs>
+          <w:tab w:val="num" w:pos="4320"/>
+        </w:tabs>
+        <w:ind w:left="4320" w:hanging="360"/>
+      </w:pPr>
+    </w:lvl>
+    <w:lvl w:ilvl="6" w:tentative="1">
+      <w:start w:val="1"/>
+      <w:numFmt w:val="decimal"/>
+      <w:lvlText w:val="%7."/>
+      <w:lvlJc w:val="left"/>
+      <w:pPr>
+        <w:tabs>
+          <w:tab w:val="num" w:pos="5040"/>
+        </w:tabs>
+        <w:ind w:left="5040" w:hanging="360"/>
+      </w:pPr>
+    </w:lvl>
+    <w:lvl w:ilvl="7" w:tentative="1">
+      <w:start w:val="1"/>
+      <w:numFmt w:val="decimal"/>
+      <w:lvlText w:val="%8."/>
+      <w:lvlJc w:val="left"/>
+      <w:pPr>
+        <w:tabs>
+          <w:tab w:val="num" w:pos="5760"/>
+        </w:tabs>
+        <w:ind w:left="5760" w:hanging="360"/>
+      </w:pPr>
+    </w:lvl>
+    <w:lvl w:ilvl="8" w:tentative="1">
+      <w:start w:val="1"/>
+      <w:numFmt w:val="decimal"/>
+      <w:lvlText w:val="%9."/>
+      <w:lvlJc w:val="left"/>
+      <w:pPr>
+        <w:tabs>
+          <w:tab w:val="num" w:pos="6480"/>
+        </w:tabs>
         <w:ind w:left="6480" w:hanging="360"/>
       </w:pPr>
     </w:lvl>
@@ -4712,6 +5811,15 @@
     <w:lvlOverride w:ilvl="0">
       <w:startOverride w:val="1"/>
     </w:lvlOverride>
+  </w:num>
+  <w:num w:numId="30" w16cid:durableId="1630630063">
+    <w:abstractNumId w:val="4"/>
+  </w:num>
+  <w:num w:numId="31" w16cid:durableId="923685953">
+    <w:abstractNumId w:val="3"/>
+  </w:num>
+  <w:num w:numId="32" w16cid:durableId="256400592">
+    <w:abstractNumId w:val="2"/>
   </w:num>
 </w:numbering>
 </file>

</xml_diff>

<commit_message>
feat(sprint-3): finaliza casos de uso CU-04 y CU-05, diagrama subsistema 2 y cierre de EVA 3 .
</commit_message>
<xml_diff>
--- a/BuildCorp/docs/Informe EVA 3 – BuildCorp Sistema de Alquiler y Control de Herramientas.docx
+++ b/BuildCorp/docs/Informe EVA 3 – BuildCorp Sistema de Alquiler y Control de Herramientas.docx
@@ -233,21 +233,7 @@
         <w:rPr>
           <w:lang w:val="es-CL"/>
         </w:rPr>
-        <w:t xml:space="preserve">1. Definición de </w:t>
-      </w:r>
-      <w:proofErr w:type="spellStart"/>
-      <w:r>
-        <w:rPr>
-          <w:lang w:val="es-CL"/>
-        </w:rPr>
-        <w:t>Sprints</w:t>
-      </w:r>
-      <w:proofErr w:type="spellEnd"/>
-      <w:r>
-        <w:rPr>
-          <w:lang w:val="es-CL"/>
-        </w:rPr>
-        <w:t>, Hitos y Carta Gantt</w:t>
+        <w:t>1. Definición de Sprints, Hitos y Carta Gantt</w:t>
       </w:r>
     </w:p>
     <w:p>
@@ -298,23 +284,7 @@
           <w:i/>
           <w:lang w:val="es-CL"/>
         </w:rPr>
-        <w:t xml:space="preserve">Sprint </w:t>
-      </w:r>
-      <w:proofErr w:type="spellStart"/>
-      <w:r>
-        <w:rPr>
-          <w:i/>
-          <w:lang w:val="es-CL"/>
-        </w:rPr>
-        <w:t>Goal</w:t>
-      </w:r>
-      <w:proofErr w:type="spellEnd"/>
-      <w:r>
-        <w:rPr>
-          <w:i/>
-          <w:lang w:val="es-CL"/>
-        </w:rPr>
-        <w:t>:</w:t>
+        <w:t>Sprint Goal:</w:t>
       </w:r>
       <w:r>
         <w:rPr>
@@ -358,23 +328,7 @@
           <w:i/>
           <w:lang w:val="es-CL"/>
         </w:rPr>
-        <w:t xml:space="preserve">Sprint </w:t>
-      </w:r>
-      <w:proofErr w:type="spellStart"/>
-      <w:r>
-        <w:rPr>
-          <w:i/>
-          <w:lang w:val="es-CL"/>
-        </w:rPr>
-        <w:t>Goal</w:t>
-      </w:r>
-      <w:proofErr w:type="spellEnd"/>
-      <w:r>
-        <w:rPr>
-          <w:i/>
-          <w:lang w:val="es-CL"/>
-        </w:rPr>
-        <w:t>:</w:t>
+        <w:t>Sprint Goal:</w:t>
       </w:r>
       <w:r>
         <w:rPr>
@@ -418,23 +372,7 @@
           <w:i/>
           <w:lang w:val="es-CL"/>
         </w:rPr>
-        <w:t xml:space="preserve">Sprint </w:t>
-      </w:r>
-      <w:proofErr w:type="spellStart"/>
-      <w:r>
-        <w:rPr>
-          <w:i/>
-          <w:lang w:val="es-CL"/>
-        </w:rPr>
-        <w:t>Goal</w:t>
-      </w:r>
-      <w:proofErr w:type="spellEnd"/>
-      <w:r>
-        <w:rPr>
-          <w:i/>
-          <w:lang w:val="es-CL"/>
-        </w:rPr>
-        <w:t>:</w:t>
+        <w:t>Sprint Goal:</w:t>
       </w:r>
       <w:r>
         <w:rPr>
@@ -478,23 +416,7 @@
           <w:i/>
           <w:lang w:val="es-CL"/>
         </w:rPr>
-        <w:t xml:space="preserve">Sprint </w:t>
-      </w:r>
-      <w:proofErr w:type="spellStart"/>
-      <w:r>
-        <w:rPr>
-          <w:i/>
-          <w:lang w:val="es-CL"/>
-        </w:rPr>
-        <w:t>Goal</w:t>
-      </w:r>
-      <w:proofErr w:type="spellEnd"/>
-      <w:r>
-        <w:rPr>
-          <w:i/>
-          <w:lang w:val="es-CL"/>
-        </w:rPr>
-        <w:t>:</w:t>
+        <w:t>Sprint Goal:</w:t>
       </w:r>
       <w:r>
         <w:rPr>
@@ -606,21 +528,7 @@
         <w:rPr>
           <w:lang w:val="es-CL"/>
         </w:rPr>
-        <w:t>Para garantizar la realidad operativa del proyecto, se establecieron puntos de control formales con la contraparte (</w:t>
-      </w:r>
-      <w:proofErr w:type="gramStart"/>
-      <w:r>
-        <w:rPr>
-          <w:lang w:val="es-CL"/>
-        </w:rPr>
-        <w:t>Director</w:t>
-      </w:r>
-      <w:proofErr w:type="gramEnd"/>
-      <w:r>
-        <w:rPr>
-          <w:lang w:val="es-CL"/>
-        </w:rPr>
-        <w:t xml:space="preserve"> de Operaciones / Cliente BuildCorp):</w:t>
+        <w:t>Para garantizar la realidad operativa del proyecto, se establecieron puntos de control formales con la contraparte (Director de Operaciones / Cliente BuildCorp):</w:t>
       </w:r>
     </w:p>
     <w:tbl>
@@ -647,13 +555,8 @@
           </w:tcPr>
           <w:p>
             <w:r>
-              <w:t xml:space="preserve">Hito / </w:t>
-            </w:r>
-            <w:proofErr w:type="spellStart"/>
-            <w:r>
-              <w:t>Reunión</w:t>
-            </w:r>
-            <w:proofErr w:type="spellEnd"/>
+              <w:t>Hito / Reunión</w:t>
+            </w:r>
           </w:p>
         </w:tc>
         <w:tc>
@@ -662,11 +565,9 @@
             <w:shd w:val="clear" w:color="auto" w:fill="F2F2F2"/>
           </w:tcPr>
           <w:p>
-            <w:proofErr w:type="spellStart"/>
             <w:r>
               <w:t>Fecha</w:t>
             </w:r>
-            <w:proofErr w:type="spellEnd"/>
           </w:p>
         </w:tc>
         <w:tc>
@@ -675,27 +576,9 @@
             <w:shd w:val="clear" w:color="auto" w:fill="F2F2F2"/>
           </w:tcPr>
           <w:p>
-            <w:proofErr w:type="spellStart"/>
-            <w:r>
-              <w:t>Descripción</w:t>
-            </w:r>
-            <w:proofErr w:type="spellEnd"/>
-            <w:r>
-              <w:t xml:space="preserve"> de </w:t>
-            </w:r>
-            <w:proofErr w:type="spellStart"/>
-            <w:r>
-              <w:t>Acuerdos</w:t>
-            </w:r>
-            <w:proofErr w:type="spellEnd"/>
-            <w:r>
-              <w:t xml:space="preserve"> / </w:t>
-            </w:r>
-            <w:proofErr w:type="spellStart"/>
-            <w:r>
-              <w:t>Validación</w:t>
-            </w:r>
-            <w:proofErr w:type="spellEnd"/>
+            <w:r>
+              <w:t>Descripción de Acuerdos / Validación</w:t>
+            </w:r>
           </w:p>
         </w:tc>
         <w:tc>
@@ -754,11 +637,9 @@
             <w:tcW w:w="1470" w:type="dxa"/>
           </w:tcPr>
           <w:p>
-            <w:proofErr w:type="spellStart"/>
-            <w:r>
-              <w:t>Completado</w:t>
-            </w:r>
-            <w:proofErr w:type="spellEnd"/>
+            <w:r>
+              <w:t>Done</w:t>
+            </w:r>
           </w:p>
         </w:tc>
       </w:tr>
@@ -806,11 +687,9 @@
             <w:tcW w:w="1470" w:type="dxa"/>
           </w:tcPr>
           <w:p>
-            <w:proofErr w:type="spellStart"/>
-            <w:r>
-              <w:t>Completado</w:t>
-            </w:r>
-            <w:proofErr w:type="spellEnd"/>
+            <w:r>
+              <w:t>Done</w:t>
+            </w:r>
           </w:p>
         </w:tc>
       </w:tr>
@@ -858,11 +737,9 @@
             <w:tcW w:w="1470" w:type="dxa"/>
           </w:tcPr>
           <w:p>
-            <w:proofErr w:type="spellStart"/>
-            <w:r>
-              <w:t>Pendiente</w:t>
-            </w:r>
-            <w:proofErr w:type="spellEnd"/>
+            <w:r>
+              <w:t>Done</w:t>
+            </w:r>
           </w:p>
         </w:tc>
       </w:tr>
@@ -918,11 +795,9 @@
             <w:tcW w:w="1470" w:type="dxa"/>
           </w:tcPr>
           <w:p>
-            <w:proofErr w:type="spellStart"/>
-            <w:r>
-              <w:t>Pendiente</w:t>
-            </w:r>
-            <w:proofErr w:type="spellEnd"/>
+            <w:r>
+              <w:t>Done</w:t>
+            </w:r>
           </w:p>
         </w:tc>
       </w:tr>
@@ -976,13 +851,8 @@
             <w:shd w:val="clear" w:color="auto" w:fill="F2F2F2"/>
           </w:tcPr>
           <w:p>
-            <w:proofErr w:type="spellStart"/>
-            <w:r>
-              <w:t>Descripción</w:t>
-            </w:r>
-            <w:proofErr w:type="spellEnd"/>
-            <w:r>
-              <w:t xml:space="preserve"> de la Tarea</w:t>
+            <w:r>
+              <w:t>Descripción de la Tarea</w:t>
             </w:r>
           </w:p>
         </w:tc>
@@ -993,13 +863,8 @@
           </w:tcPr>
           <w:p>
             <w:r>
-              <w:t xml:space="preserve">Sprint </w:t>
-            </w:r>
-            <w:proofErr w:type="spellStart"/>
-            <w:r>
-              <w:t>Asignado</w:t>
-            </w:r>
-            <w:proofErr w:type="spellEnd"/>
+              <w:t>Sprint Asignado</w:t>
+            </w:r>
           </w:p>
         </w:tc>
         <w:tc>
@@ -1008,11 +873,9 @@
             <w:shd w:val="clear" w:color="auto" w:fill="F2F2F2"/>
           </w:tcPr>
           <w:p>
-            <w:proofErr w:type="spellStart"/>
             <w:r>
               <w:t>Responsable</w:t>
             </w:r>
-            <w:proofErr w:type="spellEnd"/>
           </w:p>
         </w:tc>
         <w:tc>
@@ -1112,21 +975,7 @@
               <w:rPr>
                 <w:lang w:val="es-CL"/>
               </w:rPr>
-              <w:t xml:space="preserve">Definición de </w:t>
-            </w:r>
-            <w:proofErr w:type="spellStart"/>
-            <w:r>
-              <w:rPr>
-                <w:lang w:val="es-CL"/>
-              </w:rPr>
-              <w:t>Sprints</w:t>
-            </w:r>
-            <w:proofErr w:type="spellEnd"/>
-            <w:r>
-              <w:rPr>
-                <w:lang w:val="es-CL"/>
-              </w:rPr>
-              <w:t>, Sprint Goals y calendario del proyecto</w:t>
+              <w:t>Definición de Sprints, Sprint Goals y calendario del proyecto</w:t>
             </w:r>
           </w:p>
         </w:tc>
@@ -1337,7 +1186,7 @@
           </w:tcPr>
           <w:p>
             <w:r>
-              <w:t>In Progress</w:t>
+              <w:t>Done</w:t>
             </w:r>
           </w:p>
         </w:tc>
@@ -1397,7 +1246,7 @@
           </w:tcPr>
           <w:p>
             <w:r>
-              <w:t>In Progress</w:t>
+              <w:t>Done</w:t>
             </w:r>
           </w:p>
         </w:tc>
@@ -1457,7 +1306,7 @@
           </w:tcPr>
           <w:p>
             <w:r>
-              <w:t>In Progress</w:t>
+              <w:t>Done</w:t>
             </w:r>
           </w:p>
         </w:tc>
@@ -1517,7 +1366,7 @@
           </w:tcPr>
           <w:p>
             <w:r>
-              <w:t>To Do</w:t>
+              <w:t>Done</w:t>
             </w:r>
           </w:p>
         </w:tc>
@@ -1577,7 +1426,7 @@
           </w:tcPr>
           <w:p>
             <w:r>
-              <w:t>To Do</w:t>
+              <w:t>Done</w:t>
             </w:r>
           </w:p>
         </w:tc>
@@ -1637,7 +1486,7 @@
           </w:tcPr>
           <w:p>
             <w:r>
-              <w:t>To Do</w:t>
+              <w:t>Done</w:t>
             </w:r>
           </w:p>
         </w:tc>
@@ -1648,44 +1497,15 @@
         <w:pStyle w:val="Ttulo2"/>
       </w:pPr>
       <w:r>
-        <w:t xml:space="preserve">2. </w:t>
-      </w:r>
-      <w:proofErr w:type="spellStart"/>
-      <w:r>
-        <w:t>Planificación</w:t>
-      </w:r>
-      <w:proofErr w:type="spellEnd"/>
-      <w:r>
-        <w:t xml:space="preserve"> de </w:t>
-      </w:r>
-      <w:proofErr w:type="spellStart"/>
-      <w:r>
-        <w:t>Reuniones</w:t>
-      </w:r>
-      <w:proofErr w:type="spellEnd"/>
-      <w:r>
-        <w:t xml:space="preserve"> y </w:t>
-      </w:r>
-      <w:proofErr w:type="spellStart"/>
-      <w:r>
-        <w:t>Minutas</w:t>
-      </w:r>
-      <w:proofErr w:type="spellEnd"/>
+        <w:t>2. Planificación de Reuniones y Minutas</w:t>
+      </w:r>
     </w:p>
     <w:p>
       <w:pPr>
         <w:pStyle w:val="Ttulo3"/>
       </w:pPr>
       <w:r>
-        <w:t xml:space="preserve">Registro de </w:t>
-      </w:r>
-      <w:proofErr w:type="spellStart"/>
-      <w:r>
-        <w:t>Ceremonias</w:t>
-      </w:r>
-      <w:proofErr w:type="spellEnd"/>
-      <w:r>
-        <w:t xml:space="preserve"> — Sprint 1</w:t>
+        <w:t>Registro de Ceremonias — Sprint 1</w:t>
       </w:r>
     </w:p>
     <w:p>
@@ -1693,15 +1513,7 @@
         <w:pStyle w:val="Ttulo4"/>
       </w:pPr>
       <w:r>
-        <w:t xml:space="preserve">A. Sprint Planning (17 de </w:t>
-      </w:r>
-      <w:proofErr w:type="spellStart"/>
-      <w:r>
-        <w:t>octubre</w:t>
-      </w:r>
-      <w:proofErr w:type="spellEnd"/>
-      <w:r>
-        <w:t xml:space="preserve"> de 2026)</w:t>
+        <w:t>A. Sprint Planning (17 de octubre de 2026)</w:t>
       </w:r>
     </w:p>
     <w:p>
@@ -1712,30 +1524,32 @@
           <w:numId w:val="7"/>
         </w:numPr>
       </w:pPr>
-      <w:proofErr w:type="spellStart"/>
       <w:r>
         <w:rPr>
           <w:b/>
         </w:rPr>
-        <w:t>Duración</w:t>
-      </w:r>
-      <w:proofErr w:type="spellEnd"/>
+        <w:t>Duración:</w:t>
+      </w:r>
+      <w:r>
+        <w:t xml:space="preserve"> 30 minutos.</w:t>
+      </w:r>
+    </w:p>
+    <w:p>
+      <w:pPr>
+        <w:pStyle w:val="Prrafodelista"/>
+        <w:numPr>
+          <w:ilvl w:val="0"/>
+          <w:numId w:val="7"/>
+        </w:numPr>
+      </w:pPr>
       <w:r>
         <w:rPr>
           <w:b/>
         </w:rPr>
-        <w:t>:</w:t>
-      </w:r>
-      <w:r>
-        <w:t xml:space="preserve"> 30 </w:t>
-      </w:r>
-      <w:proofErr w:type="spellStart"/>
-      <w:r>
-        <w:t>minutos</w:t>
-      </w:r>
-      <w:proofErr w:type="spellEnd"/>
-      <w:r>
-        <w:t>.</w:t>
+        <w:t>Participante:</w:t>
+      </w:r>
+      <w:r>
+        <w:t xml:space="preserve"> Sebastián Durán (Developer / Scrum Master / PO local).</w:t>
       </w:r>
     </w:p>
     <w:p>
@@ -1745,71 +1559,37 @@
           <w:ilvl w:val="0"/>
           <w:numId w:val="7"/>
         </w:numPr>
-      </w:pPr>
-      <w:proofErr w:type="spellStart"/>
+        <w:rPr>
+          <w:lang w:val="es-CL"/>
+        </w:rPr>
+      </w:pPr>
       <w:r>
         <w:rPr>
           <w:b/>
-        </w:rPr>
-        <w:t>Participante</w:t>
-      </w:r>
-      <w:proofErr w:type="spellEnd"/>
+          <w:lang w:val="es-CL"/>
+        </w:rPr>
+        <w:t>Objetivo:</w:t>
+      </w:r>
+      <w:r>
+        <w:rPr>
+          <w:lang w:val="es-CL"/>
+        </w:rPr>
+        <w:t xml:space="preserve"> definir el alcance del Sprint 1, enfocado en el catálogo de activos, los estados de herramientas y el control de bodegas.</w:t>
+      </w:r>
+    </w:p>
+    <w:p>
+      <w:pPr>
+        <w:pStyle w:val="Prrafodelista"/>
+        <w:numPr>
+          <w:ilvl w:val="0"/>
+          <w:numId w:val="7"/>
+        </w:numPr>
+      </w:pPr>
       <w:r>
         <w:rPr>
           <w:b/>
         </w:rPr>
-        <w:t>:</w:t>
-      </w:r>
-      <w:r>
-        <w:t xml:space="preserve"> Sebastián Durán (Developer / Scrum Master / PO local).</w:t>
-      </w:r>
-    </w:p>
-    <w:p>
-      <w:pPr>
-        <w:pStyle w:val="Prrafodelista"/>
-        <w:numPr>
-          <w:ilvl w:val="0"/>
-          <w:numId w:val="7"/>
-        </w:numPr>
-        <w:rPr>
-          <w:lang w:val="es-CL"/>
-        </w:rPr>
-      </w:pPr>
-      <w:r>
-        <w:rPr>
-          <w:b/>
-          <w:lang w:val="es-CL"/>
-        </w:rPr>
-        <w:t>Objetivo:</w:t>
-      </w:r>
-      <w:r>
-        <w:rPr>
-          <w:lang w:val="es-CL"/>
-        </w:rPr>
-        <w:t xml:space="preserve"> definir el alcance del Sprint 1, enfocado en el catálogo de activos, los estados de herramientas y el control de bodegas.</w:t>
-      </w:r>
-    </w:p>
-    <w:p>
-      <w:pPr>
-        <w:pStyle w:val="Prrafodelista"/>
-        <w:numPr>
-          <w:ilvl w:val="0"/>
-          <w:numId w:val="7"/>
-        </w:numPr>
-      </w:pPr>
-      <w:proofErr w:type="spellStart"/>
-      <w:r>
-        <w:rPr>
-          <w:b/>
-        </w:rPr>
-        <w:t>Acuerdos</w:t>
-      </w:r>
-      <w:proofErr w:type="spellEnd"/>
-      <w:r>
-        <w:rPr>
-          <w:b/>
-        </w:rPr>
-        <w:t>:</w:t>
+        <w:t>Acuerdos:</w:t>
       </w:r>
     </w:p>
     <w:p>
@@ -1829,43 +1609,25 @@
         </w:rPr>
         <w:t xml:space="preserve">Crear el repositorio BuildCorp con estructura de carpetas </w:t>
       </w:r>
-      <w:proofErr w:type="spellStart"/>
       <w:r>
         <w:rPr>
           <w:rStyle w:val="CodeChar"/>
           <w:lang w:val="es-CL"/>
         </w:rPr>
-        <w:t>docs</w:t>
-      </w:r>
-      <w:proofErr w:type="spellEnd"/>
+        <w:t>docs/</w:t>
+      </w:r>
+      <w:r>
+        <w:rPr>
+          <w:lang w:val="es-CL"/>
+        </w:rPr>
+        <w:t xml:space="preserve"> y </w:t>
+      </w:r>
       <w:r>
         <w:rPr>
           <w:rStyle w:val="CodeChar"/>
           <w:lang w:val="es-CL"/>
         </w:rPr>
-        <w:t>/</w:t>
-      </w:r>
-      <w:r>
-        <w:rPr>
-          <w:lang w:val="es-CL"/>
-        </w:rPr>
-        <w:t xml:space="preserve"> y </w:t>
-      </w:r>
-      <w:proofErr w:type="spellStart"/>
-      <w:r>
-        <w:rPr>
-          <w:rStyle w:val="CodeChar"/>
-          <w:lang w:val="es-CL"/>
-        </w:rPr>
-        <w:t>out</w:t>
-      </w:r>
-      <w:proofErr w:type="spellEnd"/>
-      <w:r>
-        <w:rPr>
-          <w:rStyle w:val="CodeChar"/>
-          <w:lang w:val="es-CL"/>
-        </w:rPr>
-        <w:t>/diagramas/</w:t>
+        <w:t>out/diagramas/</w:t>
       </w:r>
       <w:r>
         <w:rPr>
@@ -1889,21 +1651,7 @@
         <w:rPr>
           <w:lang w:val="es-CL"/>
         </w:rPr>
-        <w:t xml:space="preserve">Redactar la Sección I del informe, cubriendo </w:t>
-      </w:r>
-      <w:proofErr w:type="spellStart"/>
-      <w:r>
-        <w:rPr>
-          <w:lang w:val="es-CL"/>
-        </w:rPr>
-        <w:t>Sprints</w:t>
-      </w:r>
-      <w:proofErr w:type="spellEnd"/>
-      <w:r>
-        <w:rPr>
-          <w:lang w:val="es-CL"/>
-        </w:rPr>
-        <w:t>, Tablero Kanban y Minutas.</w:t>
+        <w:t>Redactar la Sección I del informe, cubriendo Sprints, Tablero Kanban y Minutas.</w:t>
       </w:r>
     </w:p>
     <w:p>
@@ -1911,23 +1659,7 @@
         <w:pStyle w:val="Ttulo4"/>
       </w:pPr>
       <w:r>
-        <w:t>B. Daily Scrum Meetings (</w:t>
-      </w:r>
-      <w:proofErr w:type="spellStart"/>
-      <w:r>
-        <w:t>frecuencia</w:t>
-      </w:r>
-      <w:proofErr w:type="spellEnd"/>
-      <w:r>
-        <w:t xml:space="preserve"> </w:t>
-      </w:r>
-      <w:proofErr w:type="spellStart"/>
-      <w:r>
-        <w:t>diaria</w:t>
-      </w:r>
-      <w:proofErr w:type="spellEnd"/>
-      <w:r>
-        <w:t>)</w:t>
+        <w:t>B. Daily Scrum Meetings (frecuencia diaria)</w:t>
       </w:r>
     </w:p>
     <w:p>
@@ -1938,46 +1670,39 @@
           <w:numId w:val="9"/>
         </w:numPr>
       </w:pPr>
-      <w:proofErr w:type="spellStart"/>
       <w:r>
         <w:rPr>
           <w:b/>
         </w:rPr>
-        <w:t>Duración</w:t>
-      </w:r>
-      <w:proofErr w:type="spellEnd"/>
+        <w:t>Duración:</w:t>
+      </w:r>
+      <w:r>
+        <w:t xml:space="preserve"> 10 minutos por sesión.</w:t>
+      </w:r>
+    </w:p>
+    <w:p>
+      <w:pPr>
+        <w:pStyle w:val="Prrafodelista"/>
+        <w:numPr>
+          <w:ilvl w:val="0"/>
+          <w:numId w:val="9"/>
+        </w:numPr>
+        <w:rPr>
+          <w:lang w:val="es-CL"/>
+        </w:rPr>
+      </w:pPr>
       <w:r>
         <w:rPr>
           <w:b/>
-        </w:rPr>
-        <w:t>:</w:t>
-      </w:r>
-      <w:r>
-        <w:t xml:space="preserve"> 10 </w:t>
-      </w:r>
-      <w:proofErr w:type="spellStart"/>
-      <w:r>
-        <w:t>minutos</w:t>
-      </w:r>
-      <w:proofErr w:type="spellEnd"/>
-      <w:r>
-        <w:t xml:space="preserve"> </w:t>
-      </w:r>
-      <w:proofErr w:type="spellStart"/>
-      <w:r>
-        <w:t>por</w:t>
-      </w:r>
-      <w:proofErr w:type="spellEnd"/>
-      <w:r>
-        <w:t xml:space="preserve"> </w:t>
-      </w:r>
-      <w:proofErr w:type="spellStart"/>
-      <w:r>
-        <w:t>sesión</w:t>
-      </w:r>
-      <w:proofErr w:type="spellEnd"/>
-      <w:r>
-        <w:t>.</w:t>
+          <w:lang w:val="es-CL"/>
+        </w:rPr>
+        <w:t>Formato:</w:t>
+      </w:r>
+      <w:r>
+        <w:rPr>
+          <w:lang w:val="es-CL"/>
+        </w:rPr>
+        <w:t xml:space="preserve"> autogestión y sincronización individual de tareas frente al Tablero Kanban.</w:t>
       </w:r>
     </w:p>
     <w:p>
@@ -1987,73 +1712,12 @@
           <w:ilvl w:val="0"/>
           <w:numId w:val="9"/>
         </w:numPr>
-        <w:rPr>
-          <w:lang w:val="es-CL"/>
-        </w:rPr>
       </w:pPr>
       <w:r>
         <w:rPr>
           <w:b/>
-          <w:lang w:val="es-CL"/>
-        </w:rPr>
-        <w:t>Formato:</w:t>
-      </w:r>
-      <w:r>
-        <w:rPr>
-          <w:lang w:val="es-CL"/>
-        </w:rPr>
-        <w:t xml:space="preserve"> autogestión y sincronización individual de tareas frente al Tablero Kanban.</w:t>
-      </w:r>
-    </w:p>
-    <w:p>
-      <w:pPr>
-        <w:pStyle w:val="Prrafodelista"/>
-        <w:numPr>
-          <w:ilvl w:val="0"/>
-          <w:numId w:val="9"/>
-        </w:numPr>
-      </w:pPr>
-      <w:proofErr w:type="spellStart"/>
-      <w:r>
-        <w:rPr>
-          <w:b/>
-        </w:rPr>
-        <w:t>Preguntas</w:t>
-      </w:r>
-      <w:proofErr w:type="spellEnd"/>
-      <w:r>
-        <w:rPr>
-          <w:b/>
-        </w:rPr>
-        <w:t xml:space="preserve"> </w:t>
-      </w:r>
-      <w:proofErr w:type="spellStart"/>
-      <w:r>
-        <w:rPr>
-          <w:b/>
-        </w:rPr>
-        <w:t>guía</w:t>
-      </w:r>
-      <w:proofErr w:type="spellEnd"/>
-      <w:r>
-        <w:rPr>
-          <w:b/>
-        </w:rPr>
-        <w:t xml:space="preserve"> </w:t>
-      </w:r>
-      <w:proofErr w:type="spellStart"/>
-      <w:r>
-        <w:rPr>
-          <w:b/>
-        </w:rPr>
-        <w:t>abordadas</w:t>
-      </w:r>
-      <w:proofErr w:type="spellEnd"/>
-      <w:r>
-        <w:rPr>
-          <w:b/>
-        </w:rPr>
-        <w:t>:</w:t>
+        </w:rPr>
+        <w:t>Preguntas guía abordadas:</w:t>
       </w:r>
     </w:p>
     <w:p>
@@ -2078,21 +1742,7 @@
         <w:rPr>
           <w:lang w:val="es-CL"/>
         </w:rPr>
-        <w:t xml:space="preserve"> Configuración del repositorio y redacción de los </w:t>
-      </w:r>
-      <w:proofErr w:type="spellStart"/>
-      <w:r>
-        <w:rPr>
-          <w:lang w:val="es-CL"/>
-        </w:rPr>
-        <w:t>Sprints</w:t>
-      </w:r>
-      <w:proofErr w:type="spellEnd"/>
-      <w:r>
-        <w:rPr>
-          <w:lang w:val="es-CL"/>
-        </w:rPr>
-        <w:t xml:space="preserve"> 0, 1, 2 y 3.</w:t>
+        <w:t xml:space="preserve"> Configuración del repositorio y redacción de los Sprints 0, 1, 2 y 3.</w:t>
       </w:r>
     </w:p>
     <w:p>
@@ -2222,21 +1872,7 @@
         <w:rPr>
           <w:lang w:val="es-CL"/>
         </w:rPr>
-        <w:t xml:space="preserve"> identificador único (QR / </w:t>
-      </w:r>
-      <w:proofErr w:type="spellStart"/>
-      <w:r>
-        <w:rPr>
-          <w:lang w:val="es-CL"/>
-        </w:rPr>
-        <w:t>Barcode</w:t>
-      </w:r>
-      <w:proofErr w:type="spellEnd"/>
-      <w:r>
-        <w:rPr>
-          <w:lang w:val="es-CL"/>
-        </w:rPr>
-        <w:t>).</w:t>
+        <w:t xml:space="preserve"> identificador único (QR / Barcode).</w:t>
       </w:r>
     </w:p>
     <w:p>
@@ -2492,21 +2128,7 @@
         <w:rPr>
           <w:b/>
         </w:rPr>
-        <w:t>Estado "</w:t>
-      </w:r>
-      <w:proofErr w:type="spellStart"/>
-      <w:r>
-        <w:rPr>
-          <w:b/>
-        </w:rPr>
-        <w:t>Mantenimiento</w:t>
-      </w:r>
-      <w:proofErr w:type="spellEnd"/>
-      <w:r>
-        <w:rPr>
-          <w:b/>
-        </w:rPr>
-        <w:t>":</w:t>
+        <w:t>Estado "Mantenimiento":</w:t>
       </w:r>
     </w:p>
     <w:p>
@@ -2682,21 +2304,7 @@
         <w:rPr>
           <w:lang w:val="es-CL"/>
         </w:rPr>
-        <w:t xml:space="preserve"> </w:t>
-      </w:r>
-      <w:proofErr w:type="spellStart"/>
-      <w:r>
-        <w:rPr>
-          <w:lang w:val="es-CL"/>
-        </w:rPr>
-        <w:t>subalmacenes</w:t>
-      </w:r>
-      <w:proofErr w:type="spellEnd"/>
-      <w:r>
-        <w:rPr>
-          <w:lang w:val="es-CL"/>
-        </w:rPr>
-        <w:t xml:space="preserve"> temporales ubicados en los frentes de construcción.</w:t>
+        <w:t xml:space="preserve"> subalmacenes temporales ubicados en los frentes de construcción.</w:t>
       </w:r>
     </w:p>
     <w:p>
@@ -2757,29 +2365,8 @@
         <w:pStyle w:val="Ttulo3"/>
       </w:pPr>
       <w:r>
-        <w:t xml:space="preserve">4.1 </w:t>
-      </w:r>
-      <w:proofErr w:type="spellStart"/>
-      <w:r>
-        <w:t>Identificación</w:t>
-      </w:r>
-      <w:proofErr w:type="spellEnd"/>
-      <w:r>
-        <w:t xml:space="preserve"> y </w:t>
-      </w:r>
-      <w:proofErr w:type="spellStart"/>
-      <w:r>
-        <w:t>Matriz</w:t>
-      </w:r>
-      <w:proofErr w:type="spellEnd"/>
-      <w:r>
-        <w:t xml:space="preserve"> de </w:t>
-      </w:r>
-      <w:proofErr w:type="spellStart"/>
-      <w:r>
-        <w:t>Actores</w:t>
-      </w:r>
-      <w:proofErr w:type="spellEnd"/>
+        <w:t>4.1 Identificación y Matriz de Actores</w:t>
+      </w:r>
     </w:p>
     <w:tbl>
       <w:tblPr>
@@ -2837,11 +2424,9 @@
             <w:shd w:val="clear" w:color="auto" w:fill="F2F2F2"/>
           </w:tcPr>
           <w:p>
-            <w:proofErr w:type="spellStart"/>
             <w:r>
               <w:t>Responsabilidades</w:t>
             </w:r>
-            <w:proofErr w:type="spellEnd"/>
           </w:p>
         </w:tc>
       </w:tr>
@@ -2861,11 +2446,9 @@
             <w:tcW w:w="2646" w:type="dxa"/>
           </w:tcPr>
           <w:p>
-            <w:proofErr w:type="spellStart"/>
             <w:r>
               <w:t>Bodeguero</w:t>
             </w:r>
-            <w:proofErr w:type="spellEnd"/>
           </w:p>
         </w:tc>
         <w:tc>
@@ -2913,21 +2496,8 @@
             <w:tcW w:w="2646" w:type="dxa"/>
           </w:tcPr>
           <w:p>
-            <w:proofErr w:type="spellStart"/>
-            <w:r>
-              <w:t>Contratista</w:t>
-            </w:r>
-            <w:proofErr w:type="spellEnd"/>
-            <w:r>
-              <w:t xml:space="preserve"> / </w:t>
-            </w:r>
-            <w:proofErr w:type="spellStart"/>
-            <w:r>
-              <w:t>Responsable</w:t>
-            </w:r>
-            <w:proofErr w:type="spellEnd"/>
-            <w:r>
-              <w:t xml:space="preserve"> de Obra</w:t>
+            <w:r>
+              <w:t>Contratista / Responsable de Obra</w:t>
             </w:r>
           </w:p>
         </w:tc>
@@ -2977,13 +2547,8 @@
           </w:tcPr>
           <w:p>
             <w:r>
-              <w:t xml:space="preserve">Técnico de </w:t>
-            </w:r>
-            <w:proofErr w:type="spellStart"/>
-            <w:r>
-              <w:t>Mantenimiento</w:t>
-            </w:r>
-            <w:proofErr w:type="spellEnd"/>
+              <w:t>Técnico de Mantenimiento</w:t>
+            </w:r>
           </w:p>
         </w:tc>
         <w:tc>
@@ -3031,13 +2596,8 @@
             <w:tcW w:w="2646" w:type="dxa"/>
           </w:tcPr>
           <w:p>
-            <w:proofErr w:type="spellStart"/>
-            <w:r>
-              <w:t>Administrador</w:t>
-            </w:r>
-            <w:proofErr w:type="spellEnd"/>
-            <w:r>
-              <w:t xml:space="preserve"> del Sistema</w:t>
+            <w:r>
+              <w:t>Administrador del Sistema</w:t>
             </w:r>
           </w:p>
         </w:tc>
@@ -3104,11 +2664,9 @@
             <w:tcW w:w="1074" w:type="dxa"/>
           </w:tcPr>
           <w:p>
-            <w:proofErr w:type="spellStart"/>
             <w:r>
               <w:t>Soporte</w:t>
             </w:r>
-            <w:proofErr w:type="spellEnd"/>
           </w:p>
         </w:tc>
         <w:tc>
@@ -3125,21 +2683,7 @@
               <w:rPr>
                 <w:lang w:val="es-CL"/>
               </w:rPr>
-              <w:t xml:space="preserve">Motor </w:t>
-            </w:r>
-            <w:proofErr w:type="spellStart"/>
-            <w:r>
-              <w:rPr>
-                <w:lang w:val="es-CL"/>
-              </w:rPr>
-              <w:t>backend</w:t>
-            </w:r>
-            <w:proofErr w:type="spellEnd"/>
-            <w:r>
-              <w:rPr>
-                <w:lang w:val="es-CL"/>
-              </w:rPr>
-              <w:t xml:space="preserve"> (Node.js/MySQL) que valida stock en tiempo real, calcula horas de uso para el mantenimiento preventivo y dispara bloqueos automáticos por retrasos.</w:t>
+              <w:t>Motor backend (Node.js/MySQL) que valida stock en tiempo real, calcula horas de uso para el mantenimiento preventivo y dispara bloqueos automáticos por retrasos.</w:t>
             </w:r>
           </w:p>
         </w:tc>
@@ -3156,21 +2700,7 @@
         <w:rPr>
           <w:lang w:val="es-CL"/>
         </w:rPr>
-        <w:t xml:space="preserve">4.2 Script </w:t>
-      </w:r>
-      <w:proofErr w:type="spellStart"/>
-      <w:r>
-        <w:rPr>
-          <w:lang w:val="es-CL"/>
-        </w:rPr>
-        <w:t>PlantUML</w:t>
-      </w:r>
-      <w:proofErr w:type="spellEnd"/>
-      <w:r>
-        <w:rPr>
-          <w:lang w:val="es-CL"/>
-        </w:rPr>
-        <w:t xml:space="preserve"> y Diagrama del Subsistema 1 (Préstamos y Operaciones de Obra)</w:t>
+        <w:t>4.2 Script PlantUML y Diagrama del Subsistema 1 (Préstamos y Operaciones de Obra)</w:t>
       </w:r>
     </w:p>
     <w:p>
@@ -3326,141 +2856,117 @@
       </w:r>
     </w:p>
     <w:p>
-      <w:proofErr w:type="spellStart"/>
       <w:r>
         <w:rPr>
           <w:b/>
         </w:rPr>
-        <w:t>Precondiciones</w:t>
-      </w:r>
-      <w:proofErr w:type="spellEnd"/>
+        <w:t>Precondiciones:</w:t>
+      </w:r>
+    </w:p>
+    <w:p>
+      <w:pPr>
+        <w:pStyle w:val="Prrafodelista"/>
+        <w:numPr>
+          <w:ilvl w:val="0"/>
+          <w:numId w:val="18"/>
+        </w:numPr>
+        <w:rPr>
+          <w:lang w:val="es-CL"/>
+        </w:rPr>
+      </w:pPr>
+      <w:r>
+        <w:rPr>
+          <w:lang w:val="es-CL"/>
+        </w:rPr>
+        <w:t>El activo debe encontrarse en estado "Disponible" en el sistema.</w:t>
+      </w:r>
+    </w:p>
+    <w:p>
+      <w:pPr>
+        <w:pStyle w:val="Prrafodelista"/>
+        <w:numPr>
+          <w:ilvl w:val="0"/>
+          <w:numId w:val="18"/>
+        </w:numPr>
+        <w:rPr>
+          <w:lang w:val="es-CL"/>
+        </w:rPr>
+      </w:pPr>
+      <w:r>
+        <w:rPr>
+          <w:lang w:val="es-CL"/>
+        </w:rPr>
+        <w:t>El Contratista / Responsable de Obra debe estar registrado y activo en el sistema, sin morosidades vigentes.</w:t>
+      </w:r>
+    </w:p>
+    <w:p>
       <w:r>
         <w:rPr>
           <w:b/>
         </w:rPr>
-        <w:t>:</w:t>
-      </w:r>
-    </w:p>
-    <w:p>
-      <w:pPr>
-        <w:pStyle w:val="Prrafodelista"/>
-        <w:numPr>
-          <w:ilvl w:val="0"/>
-          <w:numId w:val="18"/>
-        </w:numPr>
-        <w:rPr>
-          <w:lang w:val="es-CL"/>
-        </w:rPr>
-      </w:pPr>
-      <w:r>
-        <w:rPr>
-          <w:lang w:val="es-CL"/>
-        </w:rPr>
-        <w:t>El activo debe encontrarse en estado "Disponible" en el sistema.</w:t>
-      </w:r>
-    </w:p>
-    <w:p>
-      <w:pPr>
-        <w:pStyle w:val="Prrafodelista"/>
-        <w:numPr>
-          <w:ilvl w:val="0"/>
-          <w:numId w:val="18"/>
-        </w:numPr>
-        <w:rPr>
-          <w:lang w:val="es-CL"/>
-        </w:rPr>
-      </w:pPr>
-      <w:r>
-        <w:rPr>
-          <w:lang w:val="es-CL"/>
-        </w:rPr>
-        <w:t>El Contratista / Responsable de Obra debe estar registrado y activo en el sistema, sin morosidades vigentes.</w:t>
-      </w:r>
-    </w:p>
-    <w:p>
-      <w:proofErr w:type="spellStart"/>
+        <w:t>Postcondiciones:</w:t>
+      </w:r>
+    </w:p>
+    <w:p>
+      <w:pPr>
+        <w:pStyle w:val="Prrafodelista"/>
+        <w:numPr>
+          <w:ilvl w:val="0"/>
+          <w:numId w:val="19"/>
+        </w:numPr>
+        <w:rPr>
+          <w:lang w:val="es-CL"/>
+        </w:rPr>
+      </w:pPr>
+      <w:r>
+        <w:rPr>
+          <w:lang w:val="es-CL"/>
+        </w:rPr>
+        <w:t>El estado del activo cambia automáticamente de "Disponible" a "En Uso".</w:t>
+      </w:r>
+    </w:p>
+    <w:p>
+      <w:pPr>
+        <w:pStyle w:val="Prrafodelista"/>
+        <w:numPr>
+          <w:ilvl w:val="0"/>
+          <w:numId w:val="19"/>
+        </w:numPr>
+        <w:rPr>
+          <w:lang w:val="es-CL"/>
+        </w:rPr>
+      </w:pPr>
+      <w:r>
+        <w:rPr>
+          <w:lang w:val="es-CL"/>
+        </w:rPr>
+        <w:t>Se genera un registro de préstamo en la base de datos, asociado al RUT del responsable y a la fecha y hora actuales.</w:t>
+      </w:r>
+    </w:p>
+    <w:p>
+      <w:pPr>
+        <w:pStyle w:val="Prrafodelista"/>
+        <w:numPr>
+          <w:ilvl w:val="0"/>
+          <w:numId w:val="19"/>
+        </w:numPr>
+        <w:rPr>
+          <w:lang w:val="es-CL"/>
+        </w:rPr>
+      </w:pPr>
+      <w:r>
+        <w:rPr>
+          <w:lang w:val="es-CL"/>
+        </w:rPr>
+        <w:t>Se vincula obligatoriamente la firma digital capturada en terreno.</w:t>
+      </w:r>
+    </w:p>
+    <w:p>
       <w:r>
         <w:rPr>
           <w:b/>
         </w:rPr>
-        <w:t>Postcondiciones</w:t>
-      </w:r>
-      <w:proofErr w:type="spellEnd"/>
-      <w:r>
-        <w:rPr>
-          <w:b/>
-        </w:rPr>
-        <w:t>:</w:t>
-      </w:r>
-    </w:p>
-    <w:p>
-      <w:pPr>
-        <w:pStyle w:val="Prrafodelista"/>
-        <w:numPr>
-          <w:ilvl w:val="0"/>
-          <w:numId w:val="19"/>
-        </w:numPr>
-        <w:rPr>
-          <w:lang w:val="es-CL"/>
-        </w:rPr>
-      </w:pPr>
-      <w:r>
-        <w:rPr>
-          <w:lang w:val="es-CL"/>
-        </w:rPr>
-        <w:t>El estado del activo cambia automáticamente de "Disponible" a "En Uso".</w:t>
-      </w:r>
-    </w:p>
-    <w:p>
-      <w:pPr>
-        <w:pStyle w:val="Prrafodelista"/>
-        <w:numPr>
-          <w:ilvl w:val="0"/>
-          <w:numId w:val="19"/>
-        </w:numPr>
-        <w:rPr>
-          <w:lang w:val="es-CL"/>
-        </w:rPr>
-      </w:pPr>
-      <w:r>
-        <w:rPr>
-          <w:lang w:val="es-CL"/>
-        </w:rPr>
-        <w:t>Se genera un registro de préstamo en la base de datos, asociado al RUT del responsable y a la fecha y hora actuales.</w:t>
-      </w:r>
-    </w:p>
-    <w:p>
-      <w:pPr>
-        <w:pStyle w:val="Prrafodelista"/>
-        <w:numPr>
-          <w:ilvl w:val="0"/>
-          <w:numId w:val="19"/>
-        </w:numPr>
-        <w:rPr>
-          <w:lang w:val="es-CL"/>
-        </w:rPr>
-      </w:pPr>
-      <w:r>
-        <w:rPr>
-          <w:lang w:val="es-CL"/>
-        </w:rPr>
-        <w:t>Se vincula obligatoriamente la firma digital capturada en terreno.</w:t>
-      </w:r>
-    </w:p>
-    <w:p>
-      <w:proofErr w:type="spellStart"/>
-      <w:r>
-        <w:rPr>
-          <w:b/>
-        </w:rPr>
-        <w:t>Flujo</w:t>
-      </w:r>
-      <w:proofErr w:type="spellEnd"/>
-      <w:r>
-        <w:rPr>
-          <w:b/>
-        </w:rPr>
-        <w:t xml:space="preserve"> principal (normal):</w:t>
+        <w:t>Flujo principal (normal):</w:t>
       </w:r>
     </w:p>
     <w:p>
@@ -3496,21 +3002,7 @@
         <w:rPr>
           <w:lang w:val="es-CL"/>
         </w:rPr>
-        <w:t>El sistema solicita el código de serie del activo (o lectura de código QR/</w:t>
-      </w:r>
-      <w:proofErr w:type="spellStart"/>
-      <w:r>
-        <w:rPr>
-          <w:lang w:val="es-CL"/>
-        </w:rPr>
-        <w:t>Barcode</w:t>
-      </w:r>
-      <w:proofErr w:type="spellEnd"/>
-      <w:r>
-        <w:rPr>
-          <w:lang w:val="es-CL"/>
-        </w:rPr>
-        <w:t>) y el RUT del Contratista.</w:t>
+        <w:t>El sistema solicita el código de serie del activo (o lectura de código QR/Barcode) y el RUT del Contratista.</w:t>
       </w:r>
     </w:p>
     <w:p>
@@ -3623,19 +3115,11 @@
       </w:r>
     </w:p>
     <w:p>
-      <w:proofErr w:type="spellStart"/>
       <w:r>
         <w:rPr>
           <w:b/>
         </w:rPr>
-        <w:t>Flujos</w:t>
-      </w:r>
-      <w:proofErr w:type="spellEnd"/>
-      <w:r>
-        <w:rPr>
-          <w:b/>
-        </w:rPr>
-        <w:t xml:space="preserve"> alternativos:</w:t>
+        <w:t>Flujos alternativos:</w:t>
       </w:r>
     </w:p>
     <w:p>
@@ -3823,266 +3307,234 @@
       </w:r>
     </w:p>
     <w:p>
-      <w:proofErr w:type="spellStart"/>
       <w:r>
         <w:rPr>
           <w:b/>
         </w:rPr>
-        <w:t>Precondiciones</w:t>
-      </w:r>
-      <w:proofErr w:type="spellEnd"/>
+        <w:t>Precondiciones:</w:t>
+      </w:r>
+    </w:p>
+    <w:p>
+      <w:pPr>
+        <w:pStyle w:val="Prrafodelista"/>
+        <w:numPr>
+          <w:ilvl w:val="0"/>
+          <w:numId w:val="24"/>
+        </w:numPr>
+        <w:rPr>
+          <w:lang w:val="es-CL"/>
+        </w:rPr>
+      </w:pPr>
+      <w:r>
+        <w:rPr>
+          <w:lang w:val="es-CL"/>
+        </w:rPr>
+        <w:t>El activo debe encontrarse registrado previamente en estado "En Uso".</w:t>
+      </w:r>
+    </w:p>
+    <w:p>
       <w:r>
         <w:rPr>
           <w:b/>
         </w:rPr>
-        <w:t>:</w:t>
-      </w:r>
-    </w:p>
-    <w:p>
-      <w:pPr>
-        <w:pStyle w:val="Prrafodelista"/>
-        <w:numPr>
-          <w:ilvl w:val="0"/>
-          <w:numId w:val="24"/>
-        </w:numPr>
-        <w:rPr>
-          <w:lang w:val="es-CL"/>
-        </w:rPr>
-      </w:pPr>
-      <w:r>
-        <w:rPr>
-          <w:lang w:val="es-CL"/>
-        </w:rPr>
-        <w:t>El activo debe encontrarse registrado previamente en estado "En Uso".</w:t>
-      </w:r>
-    </w:p>
-    <w:p>
-      <w:proofErr w:type="spellStart"/>
+        <w:t>Postcondiciones:</w:t>
+      </w:r>
+    </w:p>
+    <w:p>
+      <w:pPr>
+        <w:pStyle w:val="Prrafodelista"/>
+        <w:numPr>
+          <w:ilvl w:val="0"/>
+          <w:numId w:val="25"/>
+        </w:numPr>
+        <w:rPr>
+          <w:lang w:val="es-CL"/>
+        </w:rPr>
+      </w:pPr>
+      <w:r>
+        <w:rPr>
+          <w:lang w:val="es-CL"/>
+        </w:rPr>
+        <w:t>El estado del activo cambia a "Disponible" (si está operativo) o a "Mantenimiento" / "Dado de Baja" (si presenta daños).</w:t>
+      </w:r>
+    </w:p>
+    <w:p>
+      <w:pPr>
+        <w:pStyle w:val="Prrafodelista"/>
+        <w:numPr>
+          <w:ilvl w:val="0"/>
+          <w:numId w:val="25"/>
+        </w:numPr>
+        <w:rPr>
+          <w:lang w:val="es-CL"/>
+        </w:rPr>
+      </w:pPr>
+      <w:r>
+        <w:rPr>
+          <w:lang w:val="es-CL"/>
+        </w:rPr>
+        <w:t>Se libera al contratista de la responsabilidad sobre el activo en la base de datos.</w:t>
+      </w:r>
+    </w:p>
+    <w:p>
+      <w:pPr>
+        <w:pStyle w:val="Prrafodelista"/>
+        <w:numPr>
+          <w:ilvl w:val="0"/>
+          <w:numId w:val="25"/>
+        </w:numPr>
+        <w:rPr>
+          <w:lang w:val="es-CL"/>
+        </w:rPr>
+      </w:pPr>
+      <w:r>
+        <w:rPr>
+          <w:lang w:val="es-CL"/>
+        </w:rPr>
+        <w:t>Se genera un comprobante de devolución digital.</w:t>
+      </w:r>
+    </w:p>
+    <w:p>
       <w:r>
         <w:rPr>
           <w:b/>
         </w:rPr>
-        <w:t>Postcondiciones</w:t>
-      </w:r>
-      <w:proofErr w:type="spellEnd"/>
+        <w:t>Flujo principal (normal):</w:t>
+      </w:r>
+    </w:p>
+    <w:p>
+      <w:pPr>
+        <w:pStyle w:val="Prrafodelista"/>
+        <w:numPr>
+          <w:ilvl w:val="0"/>
+          <w:numId w:val="26"/>
+        </w:numPr>
+        <w:rPr>
+          <w:lang w:val="es-CL"/>
+        </w:rPr>
+      </w:pPr>
+      <w:r>
+        <w:rPr>
+          <w:lang w:val="es-CL"/>
+        </w:rPr>
+        <w:t>El Bodeguero ingresa a la sección de devoluciones en el sistema.</w:t>
+      </w:r>
+    </w:p>
+    <w:p>
+      <w:pPr>
+        <w:pStyle w:val="Prrafodelista"/>
+        <w:numPr>
+          <w:ilvl w:val="0"/>
+          <w:numId w:val="26"/>
+        </w:numPr>
+        <w:rPr>
+          <w:lang w:val="es-CL"/>
+        </w:rPr>
+      </w:pPr>
+      <w:r>
+        <w:rPr>
+          <w:lang w:val="es-CL"/>
+        </w:rPr>
+        <w:t>El sistema solicita el código de la herramienta devuelta.</w:t>
+      </w:r>
+    </w:p>
+    <w:p>
+      <w:pPr>
+        <w:pStyle w:val="Prrafodelista"/>
+        <w:numPr>
+          <w:ilvl w:val="0"/>
+          <w:numId w:val="26"/>
+        </w:numPr>
+        <w:rPr>
+          <w:lang w:val="es-CL"/>
+        </w:rPr>
+      </w:pPr>
+      <w:r>
+        <w:rPr>
+          <w:lang w:val="es-CL"/>
+        </w:rPr>
+        <w:t>El Bodeguero escanea o ingresa el código del activo.</w:t>
+      </w:r>
+    </w:p>
+    <w:p>
+      <w:pPr>
+        <w:pStyle w:val="Prrafodelista"/>
+        <w:numPr>
+          <w:ilvl w:val="0"/>
+          <w:numId w:val="26"/>
+        </w:numPr>
+        <w:rPr>
+          <w:lang w:val="es-CL"/>
+        </w:rPr>
+      </w:pPr>
+      <w:r>
+        <w:rPr>
+          <w:lang w:val="es-CL"/>
+        </w:rPr>
+        <w:t>El sistema despliega la información del préstamo activo y del responsable asociado.</w:t>
+      </w:r>
+    </w:p>
+    <w:p>
+      <w:pPr>
+        <w:pStyle w:val="Prrafodelista"/>
+        <w:numPr>
+          <w:ilvl w:val="0"/>
+          <w:numId w:val="26"/>
+        </w:numPr>
+        <w:rPr>
+          <w:lang w:val="es-CL"/>
+        </w:rPr>
+      </w:pPr>
+      <w:r>
+        <w:rPr>
+          <w:lang w:val="es-CL"/>
+        </w:rPr>
+        <w:t>El Bodeguero realiza una inspección física visual de la herramienta y selecciona su estado de recepción (Operativa o Con Daños/Desgaste).</w:t>
+      </w:r>
+    </w:p>
+    <w:p>
+      <w:pPr>
+        <w:pStyle w:val="Prrafodelista"/>
+        <w:numPr>
+          <w:ilvl w:val="0"/>
+          <w:numId w:val="26"/>
+        </w:numPr>
+        <w:rPr>
+          <w:lang w:val="es-CL"/>
+        </w:rPr>
+      </w:pPr>
+      <w:r>
+        <w:rPr>
+          <w:lang w:val="es-CL"/>
+        </w:rPr>
+        <w:t>El sistema actualiza el estado del activo a "Disponible" y registra la hora de devolución.</w:t>
+      </w:r>
+    </w:p>
+    <w:p>
+      <w:pPr>
+        <w:pStyle w:val="Prrafodelista"/>
+        <w:numPr>
+          <w:ilvl w:val="0"/>
+          <w:numId w:val="26"/>
+        </w:numPr>
+        <w:rPr>
+          <w:lang w:val="es-CL"/>
+        </w:rPr>
+      </w:pPr>
+      <w:r>
+        <w:rPr>
+          <w:lang w:val="es-CL"/>
+        </w:rPr>
+        <w:t>El sistema ejecuta el caso de uso CU-05: Generar Comprobante Digital para el cierre del ciclo.</w:t>
+      </w:r>
+    </w:p>
+    <w:p>
       <w:r>
         <w:rPr>
           <w:b/>
         </w:rPr>
-        <w:t>:</w:t>
-      </w:r>
-    </w:p>
-    <w:p>
-      <w:pPr>
-        <w:pStyle w:val="Prrafodelista"/>
-        <w:numPr>
-          <w:ilvl w:val="0"/>
-          <w:numId w:val="25"/>
-        </w:numPr>
-        <w:rPr>
-          <w:lang w:val="es-CL"/>
-        </w:rPr>
-      </w:pPr>
-      <w:r>
-        <w:rPr>
-          <w:lang w:val="es-CL"/>
-        </w:rPr>
-        <w:t>El estado del activo cambia a "Disponible" (si está operativo) o a "Mantenimiento" / "Dado de Baja" (si presenta daños).</w:t>
-      </w:r>
-    </w:p>
-    <w:p>
-      <w:pPr>
-        <w:pStyle w:val="Prrafodelista"/>
-        <w:numPr>
-          <w:ilvl w:val="0"/>
-          <w:numId w:val="25"/>
-        </w:numPr>
-        <w:rPr>
-          <w:lang w:val="es-CL"/>
-        </w:rPr>
-      </w:pPr>
-      <w:r>
-        <w:rPr>
-          <w:lang w:val="es-CL"/>
-        </w:rPr>
-        <w:t>Se libera al contratista de la responsabilidad sobre el activo en la base de datos.</w:t>
-      </w:r>
-    </w:p>
-    <w:p>
-      <w:pPr>
-        <w:pStyle w:val="Prrafodelista"/>
-        <w:numPr>
-          <w:ilvl w:val="0"/>
-          <w:numId w:val="25"/>
-        </w:numPr>
-        <w:rPr>
-          <w:lang w:val="es-CL"/>
-        </w:rPr>
-      </w:pPr>
-      <w:r>
-        <w:rPr>
-          <w:lang w:val="es-CL"/>
-        </w:rPr>
-        <w:t>Se genera un comprobante de devolución digital.</w:t>
-      </w:r>
-    </w:p>
-    <w:p>
-      <w:proofErr w:type="spellStart"/>
-      <w:r>
-        <w:rPr>
-          <w:b/>
-        </w:rPr>
-        <w:t>Flujo</w:t>
-      </w:r>
-      <w:proofErr w:type="spellEnd"/>
-      <w:r>
-        <w:rPr>
-          <w:b/>
-        </w:rPr>
-        <w:t xml:space="preserve"> principal (normal):</w:t>
-      </w:r>
-    </w:p>
-    <w:p>
-      <w:pPr>
-        <w:pStyle w:val="Prrafodelista"/>
-        <w:numPr>
-          <w:ilvl w:val="0"/>
-          <w:numId w:val="26"/>
-        </w:numPr>
-        <w:rPr>
-          <w:lang w:val="es-CL"/>
-        </w:rPr>
-      </w:pPr>
-      <w:r>
-        <w:rPr>
-          <w:lang w:val="es-CL"/>
-        </w:rPr>
-        <w:t>El Bodeguero ingresa a la sección de devoluciones en el sistema.</w:t>
-      </w:r>
-    </w:p>
-    <w:p>
-      <w:pPr>
-        <w:pStyle w:val="Prrafodelista"/>
-        <w:numPr>
-          <w:ilvl w:val="0"/>
-          <w:numId w:val="26"/>
-        </w:numPr>
-        <w:rPr>
-          <w:lang w:val="es-CL"/>
-        </w:rPr>
-      </w:pPr>
-      <w:r>
-        <w:rPr>
-          <w:lang w:val="es-CL"/>
-        </w:rPr>
-        <w:t>El sistema solicita el código de la herramienta devuelta.</w:t>
-      </w:r>
-    </w:p>
-    <w:p>
-      <w:pPr>
-        <w:pStyle w:val="Prrafodelista"/>
-        <w:numPr>
-          <w:ilvl w:val="0"/>
-          <w:numId w:val="26"/>
-        </w:numPr>
-        <w:rPr>
-          <w:lang w:val="es-CL"/>
-        </w:rPr>
-      </w:pPr>
-      <w:r>
-        <w:rPr>
-          <w:lang w:val="es-CL"/>
-        </w:rPr>
-        <w:t>El Bodeguero escanea o ingresa el código del activo.</w:t>
-      </w:r>
-    </w:p>
-    <w:p>
-      <w:pPr>
-        <w:pStyle w:val="Prrafodelista"/>
-        <w:numPr>
-          <w:ilvl w:val="0"/>
-          <w:numId w:val="26"/>
-        </w:numPr>
-        <w:rPr>
-          <w:lang w:val="es-CL"/>
-        </w:rPr>
-      </w:pPr>
-      <w:r>
-        <w:rPr>
-          <w:lang w:val="es-CL"/>
-        </w:rPr>
-        <w:t>El sistema despliega la información del préstamo activo y del responsable asociado.</w:t>
-      </w:r>
-    </w:p>
-    <w:p>
-      <w:pPr>
-        <w:pStyle w:val="Prrafodelista"/>
-        <w:numPr>
-          <w:ilvl w:val="0"/>
-          <w:numId w:val="26"/>
-        </w:numPr>
-        <w:rPr>
-          <w:lang w:val="es-CL"/>
-        </w:rPr>
-      </w:pPr>
-      <w:r>
-        <w:rPr>
-          <w:lang w:val="es-CL"/>
-        </w:rPr>
-        <w:t>El Bodeguero realiza una inspección física visual de la herramienta y selecciona su estado de recepción (Operativa o Con Daños/Desgaste).</w:t>
-      </w:r>
-    </w:p>
-    <w:p>
-      <w:pPr>
-        <w:pStyle w:val="Prrafodelista"/>
-        <w:numPr>
-          <w:ilvl w:val="0"/>
-          <w:numId w:val="26"/>
-        </w:numPr>
-        <w:rPr>
-          <w:lang w:val="es-CL"/>
-        </w:rPr>
-      </w:pPr>
-      <w:r>
-        <w:rPr>
-          <w:lang w:val="es-CL"/>
-        </w:rPr>
-        <w:t>El sistema actualiza el estado del activo a "Disponible" y registra la hora de devolución.</w:t>
-      </w:r>
-    </w:p>
-    <w:p>
-      <w:pPr>
-        <w:pStyle w:val="Prrafodelista"/>
-        <w:numPr>
-          <w:ilvl w:val="0"/>
-          <w:numId w:val="26"/>
-        </w:numPr>
-        <w:rPr>
-          <w:lang w:val="es-CL"/>
-        </w:rPr>
-      </w:pPr>
-      <w:r>
-        <w:rPr>
-          <w:lang w:val="es-CL"/>
-        </w:rPr>
-        <w:t>El sistema ejecuta el caso de uso CU-05: Generar Comprobante Digital para el cierre del ciclo.</w:t>
-      </w:r>
-    </w:p>
-    <w:p>
-      <w:proofErr w:type="spellStart"/>
-      <w:r>
-        <w:rPr>
-          <w:b/>
-        </w:rPr>
         <w:lastRenderedPageBreak/>
-        <w:t>Flujos</w:t>
-      </w:r>
-      <w:proofErr w:type="spellEnd"/>
-      <w:r>
-        <w:rPr>
-          <w:b/>
-        </w:rPr>
-        <w:t xml:space="preserve"> alternativos:</w:t>
+        <w:t>Flujos alternativos:</w:t>
       </w:r>
     </w:p>
     <w:p>
@@ -4171,21 +3623,7 @@
         <w:rPr>
           <w:lang w:val="es-CL"/>
         </w:rPr>
-        <w:t xml:space="preserve"> subproceso incluido en el préstamo que permite capturar de forma táctil la firma del contratista en dispositivos móviles o </w:t>
-      </w:r>
-      <w:proofErr w:type="spellStart"/>
-      <w:r>
-        <w:rPr>
-          <w:lang w:val="es-CL"/>
-        </w:rPr>
-        <w:t>tablets</w:t>
-      </w:r>
-      <w:proofErr w:type="spellEnd"/>
-      <w:r>
-        <w:rPr>
-          <w:lang w:val="es-CL"/>
-        </w:rPr>
-        <w:t>, asegurando almacenamiento temporal local si la obra no cuenta con conexión a internet estable.</w:t>
+        <w:t xml:space="preserve"> subproceso incluido en el préstamo que permite capturar de forma táctil la firma del contratista en dispositivos móviles o tablets, asegurando almacenamiento temporal local si la obra no cuenta con conexión a internet estable.</w:t>
       </w:r>
     </w:p>
     <w:p>
@@ -4232,23 +3670,7 @@
           <w:rStyle w:val="CodeChar"/>
           <w:lang w:val="es-CL"/>
         </w:rPr>
-        <w:t>&lt;&lt;</w:t>
-      </w:r>
-      <w:proofErr w:type="spellStart"/>
-      <w:r>
-        <w:rPr>
-          <w:rStyle w:val="CodeChar"/>
-          <w:lang w:val="es-CL"/>
-        </w:rPr>
-        <w:t>include</w:t>
-      </w:r>
-      <w:proofErr w:type="spellEnd"/>
-      <w:r>
-        <w:rPr>
-          <w:rStyle w:val="CodeChar"/>
-          <w:lang w:val="es-CL"/>
-        </w:rPr>
-        <w:t>&gt;&gt;</w:t>
+        <w:t>&lt;&lt;include&gt;&gt;</w:t>
       </w:r>
       <w:r>
         <w:rPr>
@@ -4258,19 +3680,11 @@
       </w:r>
     </w:p>
     <w:p>
-      <w:proofErr w:type="spellStart"/>
       <w:r>
         <w:rPr>
           <w:b/>
         </w:rPr>
-        <w:t>Flujo</w:t>
-      </w:r>
-      <w:proofErr w:type="spellEnd"/>
-      <w:r>
-        <w:rPr>
-          <w:b/>
-        </w:rPr>
-        <w:t xml:space="preserve"> principal:</w:t>
+        <w:t>Flujo principal:</w:t>
       </w:r>
     </w:p>
     <w:p>
@@ -4288,21 +3702,7 @@
         <w:rPr>
           <w:lang w:val="es-CL"/>
         </w:rPr>
-        <w:t>El sistema habilita un panel de dibujo táctil (</w:t>
-      </w:r>
-      <w:proofErr w:type="spellStart"/>
-      <w:r>
-        <w:rPr>
-          <w:lang w:val="es-CL"/>
-        </w:rPr>
-        <w:t>Canvas</w:t>
-      </w:r>
-      <w:proofErr w:type="spellEnd"/>
-      <w:r>
-        <w:rPr>
-          <w:lang w:val="es-CL"/>
-        </w:rPr>
-        <w:t>) en la interfaz de la PWA.</w:t>
+        <w:t>El sistema habilita un panel de dibujo táctil (Canvas) en la interfaz de la PWA.</w:t>
       </w:r>
     </w:p>
     <w:p>
@@ -4320,21 +3720,7 @@
         <w:rPr>
           <w:lang w:val="es-CL"/>
         </w:rPr>
-        <w:t xml:space="preserve">El Contratista dibuja su firma utilizando el lápiz óptico o el dedo sobre la pantalla de la </w:t>
-      </w:r>
-      <w:proofErr w:type="spellStart"/>
-      <w:r>
-        <w:rPr>
-          <w:lang w:val="es-CL"/>
-        </w:rPr>
-        <w:t>tablet</w:t>
-      </w:r>
-      <w:proofErr w:type="spellEnd"/>
-      <w:r>
-        <w:rPr>
-          <w:lang w:val="es-CL"/>
-        </w:rPr>
-        <w:t>.</w:t>
+        <w:t>El Contratista dibuja su firma utilizando el lápiz óptico o el dedo sobre la pantalla de la tablet.</w:t>
       </w:r>
     </w:p>
     <w:p>
@@ -4388,21 +3774,7 @@
         <w:rPr>
           <w:lang w:val="es-CL"/>
         </w:rPr>
-        <w:t>Si hay conectividad, la firma se sincroniza de inmediato con MongoDB Atlas; si la PWA opera sin conexión, se almacena de forma segura en el almacenamiento local del navegador (</w:t>
-      </w:r>
-      <w:proofErr w:type="spellStart"/>
-      <w:r>
-        <w:rPr>
-          <w:lang w:val="es-CL"/>
-        </w:rPr>
-        <w:t>IndexedDB</w:t>
-      </w:r>
-      <w:proofErr w:type="spellEnd"/>
-      <w:r>
-        <w:rPr>
-          <w:lang w:val="es-CL"/>
-        </w:rPr>
-        <w:t>) para su posterior sincronización al recuperar la señal.</w:t>
+        <w:t>Si hay conectividad, la firma se sincroniza de inmediato con MongoDB Atlas; si la PWA opera sin conexión, se almacena de forma segura en el almacenamiento local del navegador (IndexedDB) para su posterior sincronización al recuperar la señal.</w:t>
       </w:r>
     </w:p>
     <w:p>
@@ -4540,6 +3912,7 @@
       </w:pPr>
       <w:r>
         <w:rPr>
+          <w:noProof/>
           <w:lang w:val="es-CL"/>
         </w:rPr>
         <w:drawing>
@@ -4765,21 +4138,7 @@
         <w:rPr>
           <w:lang w:val="es-CL"/>
         </w:rPr>
-        <w:t xml:space="preserve">CU-05: Generar Alerta de Morosidad y Bloqueo Descripción: mecanismo automatizado de control financiero que supervisa los plazos máximos de devolución de herramientas, emitiendo alertas </w:t>
-      </w:r>
-      <w:proofErr w:type="gramStart"/>
-      <w:r>
-        <w:rPr>
-          <w:lang w:val="es-CL"/>
-        </w:rPr>
-        <w:t>e</w:t>
-      </w:r>
-      <w:proofErr w:type="gramEnd"/>
-      <w:r>
-        <w:rPr>
-          <w:lang w:val="es-CL"/>
-        </w:rPr>
-        <w:t xml:space="preserve"> aplicando bloqueos preventivos a contratistas morosos. Actor principal: Administrador del Sistema. Actor de soporte: Sistema Central. Precondiciones: </w:t>
+        <w:t xml:space="preserve">CU-05: Generar Alerta de Morosidad y Bloqueo Descripción: mecanismo automatizado de control financiero que supervisa los plazos máximos de devolución de herramientas, emitiendo alertas e aplicando bloqueos preventivos a contratistas morosos. Actor principal: Administrador del Sistema. Actor de soporte: Sistema Central. Precondiciones: </w:t>
       </w:r>
     </w:p>
     <w:p>
@@ -4815,7 +4174,6 @@
         </w:rPr>
         <w:t>Se activa una bandera de morosidad (</w:t>
       </w:r>
-      <w:proofErr w:type="spellStart"/>
       <w:r>
         <w:rPr>
           <w:i/>
@@ -4824,7 +4182,6 @@
         </w:rPr>
         <w:t>enforces</w:t>
       </w:r>
-      <w:proofErr w:type="spellEnd"/>
       <w:r>
         <w:rPr>
           <w:lang w:val="es-CL"/>
@@ -5015,21 +4372,7 @@
         <w:rPr>
           <w:lang w:val="es-CL"/>
         </w:rPr>
-        <w:t xml:space="preserve">El desarrollo del sistema de gestión de activos para BuildCorp —ejecutado bajo modalidad unipersonal y estructurado mediante </w:t>
-      </w:r>
-      <w:proofErr w:type="spellStart"/>
-      <w:r>
-        <w:rPr>
-          <w:lang w:val="es-CL"/>
-        </w:rPr>
-        <w:t>Sprints</w:t>
-      </w:r>
-      <w:proofErr w:type="spellEnd"/>
-      <w:r>
-        <w:rPr>
-          <w:lang w:val="es-CL"/>
-        </w:rPr>
-        <w:t>— permitió modelar una solución tecnológica robusta, orientada a resolver las problemáticas críticas de pérdida de maquinaria, falta de trazabilidad en bodegas de obra y retrasos en las devoluciones en terreno.</w:t>
+        <w:t>El desarrollo del sistema de gestión de activos para BuildCorp —ejecutado bajo modalidad unipersonal y estructurado mediante Sprints— permitió modelar una solución tecnológica robusta, orientada a resolver las problemáticas críticas de pérdida de maquinaria, falta de trazabilidad en bodegas de obra y retrasos en las devoluciones en terreno.</w:t>
       </w:r>
     </w:p>
     <w:p>
@@ -5054,21 +4397,7 @@
         <w:rPr>
           <w:lang w:val="es-CL"/>
         </w:rPr>
-        <w:t xml:space="preserve"> A través de los </w:t>
-      </w:r>
-      <w:proofErr w:type="spellStart"/>
-      <w:r>
-        <w:rPr>
-          <w:lang w:val="es-CL"/>
-        </w:rPr>
-        <w:t>Sprints</w:t>
-      </w:r>
-      <w:proofErr w:type="spellEnd"/>
-      <w:r>
-        <w:rPr>
-          <w:lang w:val="es-CL"/>
-        </w:rPr>
-        <w:t xml:space="preserve"> 0 al 3, se consolidó un ciclo de desarrollo completo que abarcó desde la configuración del entorno de trabajo en GitHub hasta el modelado de diagramas UML avanzados y la especificación de casos de uso rigurosos. </w:t>
+        <w:t xml:space="preserve"> A través de los Sprints 0 al 3, se consolidó un ciclo de desarrollo completo que abarcó desde la configuración del entorno de trabajo en GitHub hasta el modelado de diagramas UML avanzados y la especificación de casos de uso rigurosos. </w:t>
       </w:r>
     </w:p>
     <w:p>
@@ -6323,6 +5652,7 @@
   <w:style w:type="character" w:default="1" w:styleId="Fuentedeprrafopredeter">
     <w:name w:val="Default Paragraph Font"/>
     <w:uiPriority w:val="1"/>
+    <w:semiHidden/>
     <w:unhideWhenUsed/>
   </w:style>
   <w:style w:type="table" w:default="1" w:styleId="Tablanormal">

</xml_diff>